<commit_message>
Simplify beginner explanations with progressive detail
Co-authored-by: arena-agent <297053741+arena-agent@users.noreply.github.com>
</commit_message>
<xml_diff>
--- a/public/Akshat-EBooks-Python-for-Absolute-Beginners.docx
+++ b/public/Akshat-EBooks-Python-for-Absolute-Beginners.docx
@@ -172,7 +172,7 @@
           <w:bCs/>
           <w:color w:val="4659A7"/>
         </w:rPr>
-        <w:t xml:space="preserve">Preface — Why Did Python Need to Exist?</w:t>
+        <w:t xml:space="preserve">Preface — Why Was Python Needed?</w:t>
       </w:r>
     </w:p>
     <w:p>
@@ -184,7 +184,7 @@
           <wp:inline distT="0" distB="0" distL="0" distR="0">
             <wp:extent cx="5334000" cy="3552825"/>
             <wp:effectExtent t="0" r="0" b="0" l="0"/>
-            <wp:docPr id="1" name="A visual path from the gap between shell scripts and C programs to readable Python and its modern uses." descr="A visual path from the gap between shell scripts and C programs to readable Python and its modern uses." title="A visual path from the gap between shell scripts and C programs to readable Python and its modern uses."/>
+            <wp:docPr id="1" name="A difficult choice leads to a simpler Python bridge and then many kinds of useful work." descr="A difficult choice leads to a simpler Python bridge and then many kinds of useful work." title="A difficult choice leads to a simpler Python bridge and then many kinds of useful work."/>
             <wp:cNvGraphicFramePr>
               <a:graphicFrameLocks xmlns:a="http://schemas.openxmlformats.org/drawingml/2006/main" noChangeAspect="1"/>
             </wp:cNvGraphicFramePr>
@@ -233,15 +233,15 @@
           <w:sz w:val="19"/>
           <w:szCs w:val="19"/>
         </w:rPr>
-        <w:t xml:space="preserve">Legend: 1 = shell scripts were convenient but limited, while C gave control but required more work. 2 = Python aimed to be readable and easy to extend. 3 = that bridge now supports automation, web services, data, science and AI.</w:t>
-      </w:r>
-    </w:p>
-    <w:p>
-      <w:pPr>
-        <w:spacing w:after="120" w:line="300"/>
-      </w:pPr>
-      <w:r>
-        <w:t xml:space="preserve">Python did not appear because the world needed another spelling for code. It appeared because programmers faced an awkward gap.</w:t>
+        <w:t xml:space="preserve">Legend: 1 = quick scripts were limited, while larger C programs took more work. 2 = Python offered a clearer middle path. 3 = people now use that path for automation, websites, data, science and AI.</w:t>
+      </w:r>
+    </w:p>
+    <w:p>
+      <w:pPr>
+        <w:spacing w:after="120" w:line="300"/>
+      </w:pPr>
+      <w:r>
+        <w:t xml:space="preserve">Python was created to solve a real problem. Programmers wanted to build useful tools without writing a large, difficult program for every small job.</w:t>
       </w:r>
     </w:p>
     <w:tbl>
@@ -286,23 +286,31 @@
                 <w:bCs/>
                 <w:color w:val="263A67"/>
               </w:rPr>
-              <w:t xml:space="preserve">The gap Python was built to cross</w:t>
-            </w:r>
-          </w:p>
-          <w:p>
-            <w:pPr>
-              <w:spacing w:after="120" w:line="300"/>
-            </w:pPr>
-            <w:r>
-              <w:t xml:space="preserve">In the late 1980s, Guido van Rossum worked on the Amoeba operating system. The team needed something easier than writing a full C program for every task. Shell scripts were convenient, but they could not easily reach Amoeba’s special system features.</w:t>
-            </w:r>
-          </w:p>
-          <w:p>
-            <w:pPr>
-              <w:spacing w:after="120" w:line="300"/>
-            </w:pPr>
-            <w:r>
-              <w:t xml:space="preserve">Guido wanted a language that was pleasant to read, useful for everyday scripts and open to extensions written in other languages. Python grew from that practical need.</w:t>
+              <w:t xml:space="preserve">The missing middle path</w:t>
+            </w:r>
+          </w:p>
+          <w:p>
+            <w:pPr>
+              <w:spacing w:after="120" w:line="300"/>
+            </w:pPr>
+            <w:r>
+              <w:t xml:space="preserve">One option was a quick shell script. It was handy, but some jobs were too large for it.</w:t>
+            </w:r>
+          </w:p>
+          <w:p>
+            <w:pPr>
+              <w:spacing w:after="120" w:line="300"/>
+            </w:pPr>
+            <w:r>
+              <w:t xml:space="preserve">Another option was a C program. It offered more control, but even a small tool could need much more code.</w:t>
+            </w:r>
+          </w:p>
+          <w:p>
+            <w:pPr>
+              <w:spacing w:after="120" w:line="300"/>
+            </w:pPr>
+            <w:r>
+              <w:t xml:space="preserve">Guido van Rossum began Python as a clearer path between those choices.</w:t>
             </w:r>
           </w:p>
         </w:tc>
@@ -320,25 +328,15 @@
           <w:bCs/>
           <w:color w:val="4659A7"/>
         </w:rPr>
-        <w:t xml:space="preserve">Why does that old problem still matter?</w:t>
-      </w:r>
-    </w:p>
-    <w:p>
-      <w:pPr>
-        <w:spacing w:after="120" w:line="300"/>
-      </w:pPr>
-      <w:r>
-        <w:t xml:space="preserve">We still want to turn an idea into a working tool without fighting unnecessary punctuation. We also need a language that can connect to fast libraries and existing systems. Python is often the </w:t>
-      </w:r>
-      <w:r>
-        <w:rPr>
-          <w:b/>
-          <w:bCs/>
-        </w:rPr>
-        <w:t xml:space="preserve">glue</w:t>
-      </w:r>
-      <w:r>
-        <w:t xml:space="preserve"> between those pieces.</w:t>
+        <w:t xml:space="preserve">What made the idea useful?</w:t>
+      </w:r>
+    </w:p>
+    <w:p>
+      <w:pPr>
+        <w:spacing w:after="120" w:line="300"/>
+      </w:pPr>
+      <w:r>
+        <w:t xml:space="preserve">Python code was designed to be readable. It could also connect to existing programs and tools. This meant we could write the simple parts clearly without throwing away powerful work already built elsewhere.</w:t>
       </w:r>
     </w:p>
     <w:tbl>
@@ -383,23 +381,23 @@
                 <w:bCs/>
                 <w:color w:val="263A67"/>
               </w:rPr>
-              <w:t xml:space="preserve">Friendly does not mean weak</w:t>
-            </w:r>
-          </w:p>
-          <w:p>
-            <w:pPr>
-              <w:spacing w:after="120" w:line="300"/>
-            </w:pPr>
-            <w:r>
-              <w:t xml:space="preserve">Python trades some low-level control for speed of thought. You can automate a folder today, build a web service later and explore data with the same core language.</w:t>
-            </w:r>
-          </w:p>
-          <w:p>
-            <w:pPr>
-              <w:spacing w:after="120" w:line="300"/>
-            </w:pPr>
-            <w:r>
-              <w:t xml:space="preserve">Python is not the best tool for every job. C can offer tighter hardware control. Java can provide a strongly structured runtime ecosystem. Learning Python first gives us clear space to learn programming ideas.</w:t>
+              <w:t xml:space="preserve">Easy to begin does not mean weak</w:t>
+            </w:r>
+          </w:p>
+          <w:p>
+            <w:pPr>
+              <w:spacing w:after="120" w:line="300"/>
+            </w:pPr>
+            <w:r>
+              <w:t xml:space="preserve">We can use Python for a five-line file sorter. Teams also use it for websites, data tools, science and AI.</w:t>
+            </w:r>
+          </w:p>
+          <w:p>
+            <w:pPr>
+              <w:spacing w:after="120" w:line="300"/>
+            </w:pPr>
+            <w:r>
+              <w:t xml:space="preserve">Python is not best for every job. No language is. It is a strong first language because its code leaves more room to see the programming idea.</w:t>
             </w:r>
           </w:p>
         </w:tc>
@@ -417,15 +415,15 @@
           <w:bCs/>
           <w:color w:val="4659A7"/>
         </w:rPr>
-        <w:t xml:space="preserve">What about AI?</w:t>
-      </w:r>
-    </w:p>
-    <w:p>
-      <w:pPr>
-        <w:spacing w:after="120" w:line="300"/>
-      </w:pPr>
-      <w:r>
-        <w:t xml:space="preserve">AI can produce code quickly. It can also produce code that is confidently wrong. We still need to predict what a program should do, inspect what it actually did and judge whether the result is safe. That is exactly how this book teaches.</w:t>
+        <w:t xml:space="preserve">Why learn when AI can write code?</w:t>
+      </w:r>
+    </w:p>
+    <w:p>
+      <w:pPr>
+        <w:spacing w:after="120" w:line="300"/>
+      </w:pPr>
+      <w:r>
+        <w:t xml:space="preserve">AI can suggest code. It cannot remove our need to judge the result. We still need to ask: What should happen? What actually happened? Is the answer safe and correct?</w:t>
       </w:r>
     </w:p>
     <w:p>
@@ -498,7 +496,7 @@
               <w:spacing w:after="120" w:line="300"/>
             </w:pPr>
             <w:r>
-              <w:t xml:space="preserve">Python began as a practical bridge between quick scripts and larger system programs.</w:t>
+              <w:t xml:space="preserve">Python was built to make useful programs easier to write and read.</w:t>
             </w:r>
           </w:p>
           <w:p>
@@ -511,7 +509,7 @@
               <w:spacing w:after="120" w:line="300"/>
             </w:pPr>
             <w:r>
-              <w:t xml:space="preserve">Readable code helps people review, repair and share ideas.</w:t>
+              <w:t xml:space="preserve">It can connect simple Python code to powerful existing tools.</w:t>
             </w:r>
           </w:p>
           <w:p>
@@ -524,7 +522,7 @@
               <w:spacing w:after="120" w:line="300"/>
             </w:pPr>
             <w:r>
-              <w:t xml:space="preserve">Python can connect to tools written in other languages.</w:t>
+              <w:t xml:space="preserve">Friendly syntax helps us focus on the idea.</w:t>
             </w:r>
           </w:p>
           <w:p>
@@ -537,7 +535,7 @@
               <w:spacing w:after="120" w:line="300"/>
             </w:pPr>
             <w:r>
-              <w:t xml:space="preserve">Our goal is not to memorise syntax. Our goal is to understand what happens next.</w:t>
+              <w:t xml:space="preserve">We will learn by guessing, running and checking.</w:t>
             </w:r>
           </w:p>
         </w:tc>
@@ -559,12 +557,12 @@
       </w:r>
     </w:p>
     <w:p>
-      <w:hyperlink w:history="1" r:id="rId6hvgnxscqjrrfet7o9ypy">
+      <w:hyperlink w:history="1" r:id="rIdogahbn1cbzk0akazbdzl5">
         <w:r>
           <w:rPr>
             <w:rStyle w:val="Hyperlink"/>
           </w:rPr>
-          <w:t xml:space="preserve">Python FAQ: why Python was created</w:t>
+          <w:t xml:space="preserve">Python’s own story: why it was created</w:t>
         </w:r>
       </w:hyperlink>
       <w:r>
@@ -577,12 +575,12 @@
       </w:r>
     </w:p>
     <w:p>
-      <w:hyperlink w:history="1" r:id="rIdp9xitnlp6lt8oyhmfwp4x">
+      <w:hyperlink w:history="1" r:id="rIdljvc2xc5weebipgkxyhte">
         <w:r>
           <w:rPr>
             <w:rStyle w:val="Hyperlink"/>
           </w:rPr>
-          <w:t xml:space="preserve">Python essay: a language for gluing systems together</w:t>
+          <w:t xml:space="preserve">Python essay: connecting software pieces</w:t>
         </w:r>
       </w:hyperlink>
       <w:r>
@@ -2622,7 +2620,7 @@
       </w:r>
     </w:p>
     <w:p>
-      <w:hyperlink w:history="1" r:id="rIdw99zd2a6lgm4rvje0iu39">
+      <w:hyperlink w:history="1" r:id="rIdwsfje3saqojwsq7xk6tsm">
         <w:r>
           <w:rPr>
             <w:rStyle w:val="Hyperlink"/>
@@ -2640,7 +2638,7 @@
       </w:r>
     </w:p>
     <w:p>
-      <w:hyperlink w:history="1" r:id="rIdygdxlahy4sssqabrjnv8_">
+      <w:hyperlink w:history="1" r:id="rIdi4fyvnz6rwr8jnbwkxsxi">
         <w:r>
           <w:rPr>
             <w:rStyle w:val="Hyperlink"/>
@@ -2724,7 +2722,7 @@
           <w:bCs/>
           <w:color w:val="263A67"/>
         </w:rPr>
-        <w:t xml:space="preserve">Lesson 2: From Code to Machine: The Hidden Journey</w:t>
+        <w:t xml:space="preserve">Lesson 2: How Does Our Code Reach the Computer?</w:t>
       </w:r>
     </w:p>
     <w:p>
@@ -2737,7 +2735,7 @@
           <w:iCs/>
           <w:color w:val="596579"/>
         </w:rPr>
-        <w:t xml:space="preserve">Send one tiny greeting through Python, C and Java—and see what each tool creates on the way.</w:t>
+        <w:t xml:space="preserve">Follow one tiny message from our file to the screen. No hidden knowledge required.</w:t>
       </w:r>
     </w:p>
     <w:p>
@@ -2749,7 +2747,7 @@
           <wp:inline distT="0" distB="0" distL="0" distR="0">
             <wp:extent cx="5334000" cy="3552825"/>
             <wp:effectExtent t="0" r="0" b="0" l="0"/>
-            <wp:docPr id="1" name="Three processing tracks connect source files to a processor and visible output." descr="Three processing tracks connect source files to a processor and visible output." title="Three processing tracks connect source files to a processor and visible output."/>
+            <wp:docPr id="1" name="Three simple routes lead from a code file to a computer chip." descr="Three simple routes lead from a code file to a computer chip." title="Three simple routes lead from a code file to a computer chip."/>
             <wp:cNvGraphicFramePr>
               <a:graphicFrameLocks xmlns:a="http://schemas.openxmlformats.org/drawingml/2006/main" noChangeAspect="1"/>
             </wp:cNvGraphicFramePr>
@@ -2798,7 +2796,7 @@
           <w:sz w:val="19"/>
           <w:szCs w:val="19"/>
         </w:rPr>
-        <w:t xml:space="preserve">Legend: the top route prepares Python code for the CPython runtime. The middle route builds a native C executable. The bottom route builds Java bytecode for a JVM.</w:t>
+        <w:t xml:space="preserve">Legend: each row starts with a file written by a person. A language tool prepares the instructions. The computer runs them and shows a result.</w:t>
       </w:r>
     </w:p>
     <w:tbl>
@@ -2843,7 +2841,7 @@
                 <w:bCs/>
                 <w:color w:val="263A67"/>
               </w:rPr>
-              <w:t xml:space="preserve">OUR MISSION · Follow one message all the way down</w:t>
+              <w:t xml:space="preserve">OUR MISSION · Find the helper between us and the machine</w:t>
             </w:r>
           </w:p>
           <w:p>
@@ -2859,10 +2857,10 @@
                 <w:color w:val="4659A7"/>
                 <w:shd w:fill="EEF1FA" w:val="clear"/>
               </w:rPr>
-              <w:t xml:space="preserve">print(message)</w:t>
-            </w:r>
-            <w:r>
-              <w:t xml:space="preserve">. A processor cannot. Our mission is to find the translators between those two worlds.</w:t>
+              <w:t xml:space="preserve">print("Hello")</w:t>
+            </w:r>
+            <w:r>
+              <w:t xml:space="preserve">. The processor cannot read Python words. Something must help in the middle.</w:t>
             </w:r>
           </w:p>
           <w:p>
@@ -2877,7 +2875,7 @@
               <w:t xml:space="preserve">What we know: </w:t>
             </w:r>
             <w:r>
-              <w:t xml:space="preserve">Source code is written for people. • The processor performs machine instructions.</w:t>
+              <w:t xml:space="preserve">We write instructions in a file. • Running the file produces a result.</w:t>
             </w:r>
           </w:p>
           <w:p>
@@ -2892,7 +2890,7 @@
               <w:t xml:space="preserve">What we need: </w:t>
             </w:r>
             <w:r>
-              <w:t xml:space="preserve">A clear map of the tools in between. • A real example of what each stage produces.</w:t>
+              <w:t xml:space="preserve">The missing middle step. • A simple reason why languages take different routes.</w:t>
             </w:r>
           </w:p>
         </w:tc>
@@ -2948,18 +2946,7 @@
               <w:spacing w:after="120" w:line="300"/>
             </w:pPr>
             <w:r>
-              <w:t xml:space="preserve">When we run </w:t>
-            </w:r>
-            <w:r>
-              <w:rPr>
-                <w:rFonts w:ascii="Consolas" w:cs="Consolas" w:eastAsia="Consolas" w:hAnsi="Consolas"/>
-                <w:color w:val="4659A7"/>
-                <w:shd w:fill="EEF1FA" w:val="clear"/>
-              </w:rPr>
-              <w:t xml:space="preserve">python greeting.py</w:t>
-            </w:r>
-            <w:r>
-              <w:t xml:space="preserve">, does the processor understand the word print?</w:t>
+              <w:t xml:space="preserve">Does the processor understand the word print?</w:t>
             </w:r>
           </w:p>
           <w:p>
@@ -2974,7 +2961,7 @@
               <w:t xml:space="preserve">Answer: </w:t>
             </w:r>
             <w:r>
-              <w:t xml:space="preserve">No. The Python implementation reads and prepares our source. Its runtime performs the work using machine instructions that the computer can execute.</w:t>
+              <w:t xml:space="preserve">No. Python is written for people. A language program helps turn our instruction into work the computer can perform.</w:t>
             </w:r>
           </w:p>
         </w:tc>
@@ -2992,25 +2979,156 @@
           <w:bCs/>
           <w:color w:val="4659A7"/>
         </w:rPr>
-        <w:t xml:space="preserve">The big idea: source code takes a route</w:t>
-      </w:r>
-    </w:p>
-    <w:p>
-      <w:pPr>
-        <w:spacing w:after="120" w:line="300"/>
-      </w:pPr>
-      <w:r>
-        <w:t xml:space="preserve">A </w:t>
-      </w:r>
-      <w:r>
-        <w:rPr>
-          <w:b/>
-          <w:bCs/>
-        </w:rPr>
-        <w:t xml:space="preserve">toolchain</w:t>
-      </w:r>
-      <w:r>
-        <w:t xml:space="preserve"> is the set of tools that changes source code into a running program. Different languages use different toolchains. The destination is the same: work the hardware can perform.</w:t>
+        <w:t xml:space="preserve">First, keep one simple picture in your head</w:t>
+      </w:r>
+    </w:p>
+    <w:p>
+      <w:pPr>
+        <w:pStyle w:val="Heading2"/>
+        <w:keepNext/>
+        <w:spacing w:after="100" w:before="240"/>
+      </w:pPr>
+      <w:r>
+        <w:rPr>
+          <w:b/>
+          <w:bCs/>
+          <w:color w:val="4659A7"/>
+        </w:rPr>
+        <w:t xml:space="preserve">Input → Process → Output</w:t>
+      </w:r>
+    </w:p>
+    <w:tbl>
+      <w:tblPr>
+        <w:tblW w:type="pct" w:w="100%"/>
+        <w:tblBorders>
+          <w:top w:val="single" w:color="auto" w:sz="4"/>
+          <w:left w:val="single" w:color="auto" w:sz="4"/>
+          <w:bottom w:val="single" w:color="auto" w:sz="4"/>
+          <w:right w:val="single" w:color="auto" w:sz="4"/>
+          <w:insideH w:val="single" w:color="auto" w:sz="4"/>
+          <w:insideV w:val="single" w:color="auto" w:sz="4"/>
+        </w:tblBorders>
+      </w:tblPr>
+      <w:tblGrid>
+        <w:gridCol w:w="100"/>
+        <w:gridCol w:w="100"/>
+        <w:gridCol w:w="100"/>
+      </w:tblGrid>
+      <w:tr>
+        <w:tc>
+          <w:tcPr>
+            <w:tcBorders>
+              <w:top w:val="single" w:color="D9E0EA" w:sz="2"/>
+              <w:left w:val="single" w:color="D9E0EA" w:sz="2"/>
+              <w:bottom w:val="single" w:color="D9E0EA" w:sz="2"/>
+              <w:right w:val="single" w:color="D9E0EA" w:sz="2"/>
+            </w:tcBorders>
+            <w:shd w:fill="F5F7FB" w:val="clear"/>
+          </w:tcPr>
+          <w:p>
+            <w:pPr>
+              <w:spacing w:after="120" w:line="300"/>
+            </w:pPr>
+            <w:r>
+              <w:rPr>
+                <w:b/>
+                <w:bCs/>
+                <w:color w:val="4659A7"/>
+              </w:rPr>
+              <w:t xml:space="preserve">Our file</w:t>
+            </w:r>
+          </w:p>
+          <w:p>
+            <w:pPr>
+              <w:spacing w:after="120" w:line="300"/>
+            </w:pPr>
+            <w:r>
+              <w:t xml:space="preserve">instructions we can read</w:t>
+            </w:r>
+          </w:p>
+        </w:tc>
+        <w:tc>
+          <w:tcPr>
+            <w:tcBorders>
+              <w:top w:val="single" w:color="D9E0EA" w:sz="2"/>
+              <w:left w:val="single" w:color="D9E0EA" w:sz="2"/>
+              <w:bottom w:val="single" w:color="D9E0EA" w:sz="2"/>
+              <w:right w:val="single" w:color="D9E0EA" w:sz="2"/>
+            </w:tcBorders>
+            <w:shd w:fill="F5F7FB" w:val="clear"/>
+          </w:tcPr>
+          <w:p>
+            <w:pPr>
+              <w:spacing w:after="120" w:line="300"/>
+            </w:pPr>
+            <w:r>
+              <w:rPr>
+                <w:b/>
+                <w:bCs/>
+                <w:color w:val="4659A7"/>
+              </w:rPr>
+              <w:t xml:space="preserve">Language helper</w:t>
+            </w:r>
+          </w:p>
+          <w:p>
+            <w:pPr>
+              <w:spacing w:after="120" w:line="300"/>
+            </w:pPr>
+            <w:r>
+              <w:t xml:space="preserve">prepares and runs them</w:t>
+            </w:r>
+          </w:p>
+        </w:tc>
+        <w:tc>
+          <w:tcPr>
+            <w:tcBorders>
+              <w:top w:val="single" w:color="D9E0EA" w:sz="2"/>
+              <w:left w:val="single" w:color="D9E0EA" w:sz="2"/>
+              <w:bottom w:val="single" w:color="D9E0EA" w:sz="2"/>
+              <w:right w:val="single" w:color="D9E0EA" w:sz="2"/>
+            </w:tcBorders>
+            <w:shd w:fill="F5F7FB" w:val="clear"/>
+          </w:tcPr>
+          <w:p>
+            <w:pPr>
+              <w:spacing w:after="120" w:line="300"/>
+            </w:pPr>
+            <w:r>
+              <w:rPr>
+                <w:b/>
+                <w:bCs/>
+                <w:color w:val="4659A7"/>
+              </w:rPr>
+              <w:t xml:space="preserve">Computer result</w:t>
+            </w:r>
+          </w:p>
+          <w:p>
+            <w:pPr>
+              <w:spacing w:after="120" w:line="300"/>
+            </w:pPr>
+            <w:r>
+              <w:t xml:space="preserve">Hello appears</w:t>
+            </w:r>
+          </w:p>
+        </w:tc>
+      </w:tr>
+    </w:tbl>
+    <w:p>
+      <w:pPr>
+        <w:spacing w:after="120" w:line="300"/>
+      </w:pPr>
+      <w:r>
+        <w:t xml:space="preserve">That middle helper is not identical for every language. The details change, but the reason stays the same: </w:t>
+      </w:r>
+      <w:r>
+        <w:rPr>
+          <w:b/>
+          <w:bCs/>
+        </w:rPr>
+        <w:t xml:space="preserve">human-friendly code must become machine work</w:t>
+      </w:r>
+      <w:r>
+        <w:t xml:space="preserve">.</w:t>
       </w:r>
     </w:p>
     <w:tbl>
@@ -3055,23 +3173,23 @@
                 <w:bCs/>
                 <w:color w:val="263A67"/>
               </w:rPr>
-              <w:t xml:space="preserve">A journey with travel documents</w:t>
-            </w:r>
-          </w:p>
-          <w:p>
-            <w:pPr>
-              <w:spacing w:after="120" w:line="300"/>
-            </w:pPr>
-            <w:r>
-              <w:t xml:space="preserve">Our idea is the traveller. Source code is the document we can read. Each stage checks or transforms that document until the local machine can act on it.</w:t>
-            </w:r>
-          </w:p>
-          <w:p>
-            <w:pPr>
-              <w:spacing w:after="120" w:line="300"/>
-            </w:pPr>
-            <w:r>
-              <w:t xml:space="preserve">Some routes prepare a native executable before the trip. Other routes travel with a runtime that translates and manages work along the way.</w:t>
+              <w:t xml:space="preserve">The note and the musician</w:t>
+            </w:r>
+          </w:p>
+          <w:p>
+            <w:pPr>
+              <w:spacing w:after="120" w:line="300"/>
+            </w:pPr>
+            <w:r>
+              <w:t xml:space="preserve">Sheet music is useful to a musician, but a piano does not read the paper by itself. The musician reads the notes and presses the keys.</w:t>
+            </w:r>
+          </w:p>
+          <w:p>
+            <w:pPr>
+              <w:spacing w:after="120" w:line="300"/>
+            </w:pPr>
+            <w:r>
+              <w:t xml:space="preserve">Our source file is like the sheet music. A language tool reads it. The processor performs the final operations.</w:t>
             </w:r>
           </w:p>
         </w:tc>
@@ -3089,15 +3207,33 @@
           <w:bCs/>
           <w:color w:val="4659A7"/>
         </w:rPr>
-        <w:t xml:space="preserve">Compare the routes with one visible result</w:t>
-      </w:r>
-    </w:p>
-    <w:p>
-      <w:pPr>
-        <w:spacing w:after="120" w:line="300"/>
-      </w:pPr>
-      <w:r>
-        <w:t xml:space="preserve">Each program below prints the same greeting. Select a route in Web View. Follow the numbered cards. The artifact line shows what exists after that stage.</w:t>
+        <w:t xml:space="preserve">Now compare three routes—one at a time</w:t>
+      </w:r>
+    </w:p>
+    <w:p>
+      <w:pPr>
+        <w:spacing w:after="120" w:line="300"/>
+      </w:pPr>
+      <w:r>
+        <w:t xml:space="preserve">Every route below prints </w:t>
+      </w:r>
+      <w:r>
+        <w:rPr>
+          <w:rFonts w:ascii="Consolas" w:cs="Consolas" w:eastAsia="Consolas" w:hAnsi="Consolas"/>
+          <w:color w:val="4659A7"/>
+          <w:shd w:fill="EEF1FA" w:val="clear"/>
+        </w:rPr>
+        <w:t xml:space="preserve">Hello</w:t>
+      </w:r>
+      <w:r>
+        <w:t xml:space="preserve">. Select a tab. Read only the four numbered cards from left to right. The small box answers one question: </w:t>
+      </w:r>
+      <w:r>
+        <w:rPr>
+          <w:b/>
+          <w:bCs/>
+        </w:rPr>
+        <w:t xml:space="preserve">what do we have at this step?</w:t>
       </w:r>
     </w:p>
     <w:p>
@@ -3127,7 +3263,7 @@
           <w:bCs/>
           <w:color w:val="4659A7"/>
         </w:rPr>
-        <w:t xml:space="preserve">🐍 Python (CPython)</w:t>
+        <w:t xml:space="preserve">🐍 Python</w:t>
       </w:r>
     </w:p>
     <w:p>
@@ -3140,7 +3276,7 @@
           <w:iCs/>
           <w:color w:val="596579"/>
         </w:rPr>
-        <w:t xml:space="preserve">Run the source with a runtime. CPython first compiles it to bytecode internally.</w:t>
+        <w:t xml:space="preserve">Python stays with us while the program runs.</w:t>
       </w:r>
     </w:p>
     <w:tbl>
@@ -3212,34 +3348,34 @@
                 <w:bCs/>
                 <w:color w:val="263A67"/>
               </w:rPr>
-              <w:t xml:space="preserve">Source</w:t>
-            </w:r>
-          </w:p>
-          <w:p>
-            <w:pPr>
-              <w:spacing w:after="120" w:line="300"/>
-            </w:pPr>
-            <w:r>
-              <w:rPr>
-                <w:b/>
-                <w:bCs/>
-              </w:rPr>
-              <w:t xml:space="preserve">Artifact: </w:t>
+              <w:t xml:space="preserve">We write</w:t>
+            </w:r>
+          </w:p>
+          <w:p>
+            <w:pPr>
+              <w:spacing w:after="120" w:line="300"/>
+            </w:pPr>
+            <w:r>
+              <w:rPr>
+                <w:b/>
+                <w:bCs/>
+              </w:rPr>
+              <w:t xml:space="preserve">What we have now: </w:t>
             </w:r>
             <w:r>
               <w:rPr>
                 <w:rFonts w:ascii="Consolas" w:cs="Consolas" w:eastAsia="Consolas" w:hAnsi="Consolas"/>
                 <w:color w:val="4659A7"/>
               </w:rPr>
-              <w:t xml:space="preserve">greeting.py</w:t>
-            </w:r>
-          </w:p>
-          <w:p>
-            <w:pPr>
-              <w:spacing w:after="120" w:line="300"/>
-            </w:pPr>
-            <w:r>
-              <w:t xml:space="preserve">We write readable Python instructions.</w:t>
+              <w:t xml:space="preserve">message.py</w:t>
+            </w:r>
+          </w:p>
+          <w:p>
+            <w:pPr>
+              <w:spacing w:after="120" w:line="300"/>
+            </w:pPr>
+            <w:r>
+              <w:t xml:space="preserve">The file contains two Python instructions.</w:t>
             </w:r>
           </w:p>
           <w:p>
@@ -3290,7 +3426,7 @@
               <w:spacing w:after="120" w:line="300"/>
             </w:pPr>
             <w:r>
-              <w:t xml:space="preserve">🧩</w:t>
+              <w:t xml:space="preserve">🔍</w:t>
             </w:r>
           </w:p>
         </w:tc>
@@ -3313,34 +3449,34 @@
                 <w:bCs/>
                 <w:color w:val="263A67"/>
               </w:rPr>
-              <w:t xml:space="preserve">Compile internally</w:t>
-            </w:r>
-          </w:p>
-          <w:p>
-            <w:pPr>
-              <w:spacing w:after="120" w:line="300"/>
-            </w:pPr>
-            <w:r>
-              <w:rPr>
-                <w:b/>
-                <w:bCs/>
-              </w:rPr>
-              <w:t xml:space="preserve">Artifact: </w:t>
+              <w:t xml:space="preserve">Python reads</w:t>
+            </w:r>
+          </w:p>
+          <w:p>
+            <w:pPr>
+              <w:spacing w:after="120" w:line="300"/>
+            </w:pPr>
+            <w:r>
+              <w:rPr>
+                <w:b/>
+                <w:bCs/>
+              </w:rPr>
+              <w:t xml:space="preserve">What we have now: </w:t>
             </w:r>
             <w:r>
               <w:rPr>
                 <w:rFonts w:ascii="Consolas" w:cs="Consolas" w:eastAsia="Consolas" w:hAnsi="Consolas"/>
                 <w:color w:val="4659A7"/>
               </w:rPr>
-              <w:t xml:space="preserve">code object + bytecode</w:t>
-            </w:r>
-          </w:p>
-          <w:p>
-            <w:pPr>
-              <w:spacing w:after="120" w:line="300"/>
-            </w:pPr>
-            <w:r>
-              <w:t xml:space="preserve">CPython checks the syntax and prepares bytecode instructions.</w:t>
+              <w:t xml:space="preserve">checked instructions</w:t>
+            </w:r>
+          </w:p>
+          <w:p>
+            <w:pPr>
+              <w:spacing w:after="120" w:line="300"/>
+            </w:pPr>
+            <w:r>
+              <w:t xml:space="preserve">Python checks the words, quotes and brackets.</w:t>
             </w:r>
           </w:p>
           <w:p>
@@ -3355,7 +3491,7 @@
                 <w:sz w:val="18"/>
                 <w:szCs w:val="18"/>
               </w:rPr>
-              <w:t xml:space="preserve">LOAD_NAME · CALL</w:t>
+              <w:t xml:space="preserve">Does the code follow Python rules?</w:t>
             </w:r>
           </w:p>
         </w:tc>
@@ -3413,34 +3549,34 @@
                 <w:bCs/>
                 <w:color w:val="263A67"/>
               </w:rPr>
-              <w:t xml:space="preserve">Python runtime</w:t>
-            </w:r>
-          </w:p>
-          <w:p>
-            <w:pPr>
-              <w:spacing w:after="120" w:line="300"/>
-            </w:pPr>
-            <w:r>
-              <w:rPr>
-                <w:b/>
-                <w:bCs/>
-              </w:rPr>
-              <w:t xml:space="preserve">Artifact: </w:t>
+              <w:t xml:space="preserve">Python runs</w:t>
+            </w:r>
+          </w:p>
+          <w:p>
+            <w:pPr>
+              <w:spacing w:after="120" w:line="300"/>
+            </w:pPr>
+            <w:r>
+              <w:rPr>
+                <w:b/>
+                <w:bCs/>
+              </w:rPr>
+              <w:t xml:space="preserve">What we have now: </w:t>
             </w:r>
             <w:r>
               <w:rPr>
                 <w:rFonts w:ascii="Consolas" w:cs="Consolas" w:eastAsia="Consolas" w:hAnsi="Consolas"/>
                 <w:color w:val="4659A7"/>
               </w:rPr>
-              <w:t xml:space="preserve">CPython process</w:t>
-            </w:r>
-          </w:p>
-          <w:p>
-            <w:pPr>
-              <w:spacing w:after="120" w:line="300"/>
-            </w:pPr>
-            <w:r>
-              <w:t xml:space="preserve">The evaluation loop performs each bytecode operation and calls lower-level code.</w:t>
+              <w:t xml:space="preserve">a running Python program</w:t>
+            </w:r>
+          </w:p>
+          <w:p>
+            <w:pPr>
+              <w:spacing w:after="120" w:line="300"/>
+            </w:pPr>
+            <w:r>
+              <w:t xml:space="preserve">Python performs the instructions in order.</w:t>
             </w:r>
           </w:p>
           <w:p>
@@ -3455,7 +3591,7 @@
                 <w:sz w:val="18"/>
                 <w:szCs w:val="18"/>
               </w:rPr>
-              <w:t xml:space="preserve">python greeting.py</w:t>
+              <w:t xml:space="preserve">python message.py</w:t>
             </w:r>
           </w:p>
         </w:tc>
@@ -3513,34 +3649,34 @@
                 <w:bCs/>
                 <w:color w:val="263A67"/>
               </w:rPr>
-              <w:t xml:space="preserve">Visible result</w:t>
-            </w:r>
-          </w:p>
-          <w:p>
-            <w:pPr>
-              <w:spacing w:after="120" w:line="300"/>
-            </w:pPr>
-            <w:r>
-              <w:rPr>
-                <w:b/>
-                <w:bCs/>
-              </w:rPr>
-              <w:t xml:space="preserve">Artifact: </w:t>
+              <w:t xml:space="preserve">We see</w:t>
+            </w:r>
+          </w:p>
+          <w:p>
+            <w:pPr>
+              <w:spacing w:after="120" w:line="300"/>
+            </w:pPr>
+            <w:r>
+              <w:rPr>
+                <w:b/>
+                <w:bCs/>
+              </w:rPr>
+              <w:t xml:space="preserve">What we have now: </w:t>
             </w:r>
             <w:r>
               <w:rPr>
                 <w:rFonts w:ascii="Consolas" w:cs="Consolas" w:eastAsia="Consolas" w:hAnsi="Consolas"/>
                 <w:color w:val="4659A7"/>
               </w:rPr>
-              <w:t xml:space="preserve">stdout</w:t>
-            </w:r>
-          </w:p>
-          <w:p>
-            <w:pPr>
-              <w:spacing w:after="120" w:line="300"/>
-            </w:pPr>
-            <w:r>
-              <w:t xml:space="preserve">The runtime asks the operating system to write the message to the output stream.</w:t>
+              <w:t xml:space="preserve">Hello</w:t>
+            </w:r>
+          </w:p>
+          <w:p>
+            <w:pPr>
+              <w:spacing w:after="120" w:line="300"/>
+            </w:pPr>
+            <w:r>
+              <w:t xml:space="preserve">The message reaches the terminal.</w:t>
             </w:r>
           </w:p>
           <w:p>
@@ -3573,7 +3709,7 @@
           <w:bCs/>
           <w:color w:val="4659A7"/>
         </w:rPr>
-        <w:t xml:space="preserve">🔧 C with GCC</w:t>
+        <w:t xml:space="preserve">🔧 C</w:t>
       </w:r>
     </w:p>
     <w:p>
@@ -3586,7 +3722,7 @@
           <w:iCs/>
           <w:color w:val="596579"/>
         </w:rPr>
-        <w:t xml:space="preserve">Build a machine-specific executable first, then run that file.</w:t>
+        <w:t xml:space="preserve">C usually builds a runnable app before we open it.</w:t>
       </w:r>
     </w:p>
     <w:tbl>
@@ -3658,34 +3794,34 @@
                 <w:bCs/>
                 <w:color w:val="263A67"/>
               </w:rPr>
-              <w:t xml:space="preserve">Source</w:t>
-            </w:r>
-          </w:p>
-          <w:p>
-            <w:pPr>
-              <w:spacing w:after="120" w:line="300"/>
-            </w:pPr>
-            <w:r>
-              <w:rPr>
-                <w:b/>
-                <w:bCs/>
-              </w:rPr>
-              <w:t xml:space="preserve">Artifact: </w:t>
+              <w:t xml:space="preserve">We write</w:t>
+            </w:r>
+          </w:p>
+          <w:p>
+            <w:pPr>
+              <w:spacing w:after="120" w:line="300"/>
+            </w:pPr>
+            <w:r>
+              <w:rPr>
+                <w:b/>
+                <w:bCs/>
+              </w:rPr>
+              <w:t xml:space="preserve">What we have now: </w:t>
             </w:r>
             <w:r>
               <w:rPr>
                 <w:rFonts w:ascii="Consolas" w:cs="Consolas" w:eastAsia="Consolas" w:hAnsi="Consolas"/>
                 <w:color w:val="4659A7"/>
               </w:rPr>
-              <w:t xml:space="preserve">greeting.c</w:t>
-            </w:r>
-          </w:p>
-          <w:p>
-            <w:pPr>
-              <w:spacing w:after="120" w:line="300"/>
-            </w:pPr>
-            <w:r>
-              <w:t xml:space="preserve">We write C source and include the declaration for printf.</w:t>
+              <w:t xml:space="preserve">message.c</w:t>
+            </w:r>
+          </w:p>
+          <w:p>
+            <w:pPr>
+              <w:spacing w:after="120" w:line="300"/>
+            </w:pPr>
+            <w:r>
+              <w:t xml:space="preserve">The file contains C instructions.</w:t>
             </w:r>
           </w:p>
           <w:p>
@@ -3735,7 +3871,7 @@
               <w:spacing w:after="120" w:line="300"/>
             </w:pPr>
             <w:r>
-              <w:t xml:space="preserve">🧱</w:t>
+              <w:t xml:space="preserve">🏗️</w:t>
             </w:r>
           </w:p>
         </w:tc>
@@ -3758,34 +3894,34 @@
                 <w:bCs/>
                 <w:color w:val="263A67"/>
               </w:rPr>
-              <w:t xml:space="preserve">Compile + assemble</w:t>
-            </w:r>
-          </w:p>
-          <w:p>
-            <w:pPr>
-              <w:spacing w:after="120" w:line="300"/>
-            </w:pPr>
-            <w:r>
-              <w:rPr>
-                <w:b/>
-                <w:bCs/>
-              </w:rPr>
-              <w:t xml:space="preserve">Artifact: </w:t>
+              <w:t xml:space="preserve">A compiler builds</w:t>
+            </w:r>
+          </w:p>
+          <w:p>
+            <w:pPr>
+              <w:spacing w:after="120" w:line="300"/>
+            </w:pPr>
+            <w:r>
+              <w:rPr>
+                <w:b/>
+                <w:bCs/>
+              </w:rPr>
+              <w:t xml:space="preserve">What we have now: </w:t>
             </w:r>
             <w:r>
               <w:rPr>
                 <w:rFonts w:ascii="Consolas" w:cs="Consolas" w:eastAsia="Consolas" w:hAnsi="Consolas"/>
                 <w:color w:val="4659A7"/>
               </w:rPr>
-              <w:t xml:space="preserve">greeting.o</w:t>
-            </w:r>
-          </w:p>
-          <w:p>
-            <w:pPr>
-              <w:spacing w:after="120" w:line="300"/>
-            </w:pPr>
-            <w:r>
-              <w:t xml:space="preserve">GCC translates the source through assembly into an object file.</w:t>
+              <w:t xml:space="preserve">prepared machine pieces</w:t>
+            </w:r>
+          </w:p>
+          <w:p>
+            <w:pPr>
+              <w:spacing w:after="120" w:line="300"/>
+            </w:pPr>
+            <w:r>
+              <w:t xml:space="preserve">A compiler translates the C code.</w:t>
             </w:r>
           </w:p>
           <w:p>
@@ -3800,7 +3936,7 @@
                 <w:sz w:val="18"/>
                 <w:szCs w:val="18"/>
               </w:rPr>
-              <w:t xml:space="preserve">gcc -c greeting.c</w:t>
+              <w:t xml:space="preserve">compiler = translator</w:t>
             </w:r>
           </w:p>
         </w:tc>
@@ -3858,34 +3994,34 @@
                 <w:bCs/>
                 <w:color w:val="263A67"/>
               </w:rPr>
-              <w:t xml:space="preserve">Link</w:t>
-            </w:r>
-          </w:p>
-          <w:p>
-            <w:pPr>
-              <w:spacing w:after="120" w:line="300"/>
-            </w:pPr>
-            <w:r>
-              <w:rPr>
-                <w:b/>
-                <w:bCs/>
-              </w:rPr>
-              <w:t xml:space="preserve">Artifact: </w:t>
+              <w:t xml:space="preserve">A linker joins</w:t>
+            </w:r>
+          </w:p>
+          <w:p>
+            <w:pPr>
+              <w:spacing w:after="120" w:line="300"/>
+            </w:pPr>
+            <w:r>
+              <w:rPr>
+                <w:b/>
+                <w:bCs/>
+              </w:rPr>
+              <w:t xml:space="preserve">What we have now: </w:t>
             </w:r>
             <w:r>
               <w:rPr>
                 <w:rFonts w:ascii="Consolas" w:cs="Consolas" w:eastAsia="Consolas" w:hAnsi="Consolas"/>
                 <w:color w:val="4659A7"/>
               </w:rPr>
-              <w:t xml:space="preserve">greeting executable</w:t>
-            </w:r>
-          </w:p>
-          <w:p>
-            <w:pPr>
-              <w:spacing w:after="120" w:line="300"/>
-            </w:pPr>
-            <w:r>
-              <w:t xml:space="preserve">The linker joins our object file with required library code.</w:t>
+              <w:t xml:space="preserve">a runnable app</w:t>
+            </w:r>
+          </w:p>
+          <w:p>
+            <w:pPr>
+              <w:spacing w:after="120" w:line="300"/>
+            </w:pPr>
+            <w:r>
+              <w:t xml:space="preserve">A linker joins the pieces the program needs.</w:t>
             </w:r>
           </w:p>
           <w:p>
@@ -3900,7 +4036,7 @@
                 <w:sz w:val="18"/>
                 <w:szCs w:val="18"/>
               </w:rPr>
-              <w:t xml:space="preserve">gcc greeting.o -o greeting</w:t>
+              <w:t xml:space="preserve">linker = piece joiner</w:t>
             </w:r>
           </w:p>
         </w:tc>
@@ -3958,34 +4094,34 @@
                 <w:bCs/>
                 <w:color w:val="263A67"/>
               </w:rPr>
-              <w:t xml:space="preserve">Run native code</w:t>
-            </w:r>
-          </w:p>
-          <w:p>
-            <w:pPr>
-              <w:spacing w:after="120" w:line="300"/>
-            </w:pPr>
-            <w:r>
-              <w:rPr>
-                <w:b/>
-                <w:bCs/>
-              </w:rPr>
-              <w:t xml:space="preserve">Artifact: </w:t>
+              <w:t xml:space="preserve">We run</w:t>
+            </w:r>
+          </w:p>
+          <w:p>
+            <w:pPr>
+              <w:spacing w:after="120" w:line="300"/>
+            </w:pPr>
+            <w:r>
+              <w:rPr>
+                <w:b/>
+                <w:bCs/>
+              </w:rPr>
+              <w:t xml:space="preserve">What we have now: </w:t>
             </w:r>
             <w:r>
               <w:rPr>
                 <w:rFonts w:ascii="Consolas" w:cs="Consolas" w:eastAsia="Consolas" w:hAnsi="Consolas"/>
                 <w:color w:val="4659A7"/>
               </w:rPr>
-              <w:t xml:space="preserve">stdout</w:t>
-            </w:r>
-          </w:p>
-          <w:p>
-            <w:pPr>
-              <w:spacing w:after="120" w:line="300"/>
-            </w:pPr>
-            <w:r>
-              <w:t xml:space="preserve">The operating system loads the executable for this machine.</w:t>
+              <w:t xml:space="preserve">Hello</w:t>
+            </w:r>
+          </w:p>
+          <w:p>
+            <w:pPr>
+              <w:spacing w:after="120" w:line="300"/>
+            </w:pPr>
+            <w:r>
+              <w:t xml:space="preserve">The computer opens the built app.</w:t>
             </w:r>
           </w:p>
           <w:p>
@@ -4000,7 +4136,7 @@
                 <w:sz w:val="18"/>
                 <w:szCs w:val="18"/>
               </w:rPr>
-              <w:t xml:space="preserve">./greeting → Hello</w:t>
+              <w:t xml:space="preserve">Hello</w:t>
             </w:r>
           </w:p>
         </w:tc>
@@ -4031,7 +4167,7 @@
           <w:iCs/>
           <w:color w:val="596579"/>
         </w:rPr>
-        <w:t xml:space="preserve">Build portable bytecode first, then let a JVM run it on the current machine.</w:t>
+        <w:t xml:space="preserve">Java builds a travel-friendly file, then a Java helper runs it.</w:t>
       </w:r>
     </w:p>
     <w:tbl>
@@ -4103,34 +4239,34 @@
                 <w:bCs/>
                 <w:color w:val="263A67"/>
               </w:rPr>
-              <w:t xml:space="preserve">Source</w:t>
-            </w:r>
-          </w:p>
-          <w:p>
-            <w:pPr>
-              <w:spacing w:after="120" w:line="300"/>
-            </w:pPr>
-            <w:r>
-              <w:rPr>
-                <w:b/>
-                <w:bCs/>
-              </w:rPr>
-              <w:t xml:space="preserve">Artifact: </w:t>
+              <w:t xml:space="preserve">We write</w:t>
+            </w:r>
+          </w:p>
+          <w:p>
+            <w:pPr>
+              <w:spacing w:after="120" w:line="300"/>
+            </w:pPr>
+            <w:r>
+              <w:rPr>
+                <w:b/>
+                <w:bCs/>
+              </w:rPr>
+              <w:t xml:space="preserve">What we have now: </w:t>
             </w:r>
             <w:r>
               <w:rPr>
                 <w:rFonts w:ascii="Consolas" w:cs="Consolas" w:eastAsia="Consolas" w:hAnsi="Consolas"/>
                 <w:color w:val="4659A7"/>
               </w:rPr>
-              <w:t xml:space="preserve">Greeting.java</w:t>
-            </w:r>
-          </w:p>
-          <w:p>
-            <w:pPr>
-              <w:spacing w:after="120" w:line="300"/>
-            </w:pPr>
-            <w:r>
-              <w:t xml:space="preserve">We write source inside a class and main method.</w:t>
+              <w:t xml:space="preserve">Message.java</w:t>
+            </w:r>
+          </w:p>
+          <w:p>
+            <w:pPr>
+              <w:spacing w:after="120" w:line="300"/>
+            </w:pPr>
+            <w:r>
+              <w:t xml:space="preserve">The file contains Java instructions.</w:t>
             </w:r>
           </w:p>
           <w:p>
@@ -4145,7 +4281,7 @@
                 <w:sz w:val="18"/>
                 <w:szCs w:val="18"/>
               </w:rPr>
-              <w:t xml:space="preserve">System.out.println("Hello");</w:t>
+              <w:t xml:space="preserve">println("Hello");</w:t>
             </w:r>
           </w:p>
         </w:tc>
@@ -4180,7 +4316,7 @@
               <w:spacing w:after="120" w:line="300"/>
             </w:pPr>
             <w:r>
-              <w:t xml:space="preserve">🏗️</w:t>
+              <w:t xml:space="preserve">📦</w:t>
             </w:r>
           </w:p>
         </w:tc>
@@ -4203,34 +4339,34 @@
                 <w:bCs/>
                 <w:color w:val="263A67"/>
               </w:rPr>
-              <w:t xml:space="preserve">Compile</w:t>
-            </w:r>
-          </w:p>
-          <w:p>
-            <w:pPr>
-              <w:spacing w:after="120" w:line="300"/>
-            </w:pPr>
-            <w:r>
-              <w:rPr>
-                <w:b/>
-                <w:bCs/>
-              </w:rPr>
-              <w:t xml:space="preserve">Artifact: </w:t>
+              <w:t xml:space="preserve">Java builds</w:t>
+            </w:r>
+          </w:p>
+          <w:p>
+            <w:pPr>
+              <w:spacing w:after="120" w:line="300"/>
+            </w:pPr>
+            <w:r>
+              <w:rPr>
+                <w:b/>
+                <w:bCs/>
+              </w:rPr>
+              <w:t xml:space="preserve">What we have now: </w:t>
             </w:r>
             <w:r>
               <w:rPr>
                 <w:rFonts w:ascii="Consolas" w:cs="Consolas" w:eastAsia="Consolas" w:hAnsi="Consolas"/>
                 <w:color w:val="4659A7"/>
               </w:rPr>
-              <w:t xml:space="preserve">Greeting.class</w:t>
-            </w:r>
-          </w:p>
-          <w:p>
-            <w:pPr>
-              <w:spacing w:after="120" w:line="300"/>
-            </w:pPr>
-            <w:r>
-              <w:t xml:space="preserve">javac checks the source and produces Java bytecode.</w:t>
+              <w:t xml:space="preserve">Message.class</w:t>
+            </w:r>
+          </w:p>
+          <w:p>
+            <w:pPr>
+              <w:spacing w:after="120" w:line="300"/>
+            </w:pPr>
+            <w:r>
+              <w:t xml:space="preserve">The Java compiler creates a class file.</w:t>
             </w:r>
           </w:p>
           <w:p>
@@ -4245,7 +4381,7 @@
                 <w:sz w:val="18"/>
                 <w:szCs w:val="18"/>
               </w:rPr>
-              <w:t xml:space="preserve">javac Greeting.java</w:t>
+              <w:t xml:space="preserve">javac Message.java</w:t>
             </w:r>
           </w:p>
         </w:tc>
@@ -4303,34 +4439,34 @@
                 <w:bCs/>
                 <w:color w:val="263A67"/>
               </w:rPr>
-              <w:t xml:space="preserve">JVM runtime</w:t>
-            </w:r>
-          </w:p>
-          <w:p>
-            <w:pPr>
-              <w:spacing w:after="120" w:line="300"/>
-            </w:pPr>
-            <w:r>
-              <w:rPr>
-                <w:b/>
-                <w:bCs/>
-              </w:rPr>
-              <w:t xml:space="preserve">Artifact: </w:t>
+              <w:t xml:space="preserve">The JVM runs</w:t>
+            </w:r>
+          </w:p>
+          <w:p>
+            <w:pPr>
+              <w:spacing w:after="120" w:line="300"/>
+            </w:pPr>
+            <w:r>
+              <w:rPr>
+                <w:b/>
+                <w:bCs/>
+              </w:rPr>
+              <w:t xml:space="preserve">What we have now: </w:t>
             </w:r>
             <w:r>
               <w:rPr>
                 <w:rFonts w:ascii="Consolas" w:cs="Consolas" w:eastAsia="Consolas" w:hAnsi="Consolas"/>
                 <w:color w:val="4659A7"/>
               </w:rPr>
-              <w:t xml:space="preserve">loaded class</w:t>
-            </w:r>
-          </w:p>
-          <w:p>
-            <w:pPr>
-              <w:spacing w:after="120" w:line="300"/>
-            </w:pPr>
-            <w:r>
-              <w:t xml:space="preserve">The Java Virtual Machine loads and verifies the class. It can interpret or JIT-compile hot code.</w:t>
+              <w:t xml:space="preserve">a running Java program</w:t>
+            </w:r>
+          </w:p>
+          <w:p>
+            <w:pPr>
+              <w:spacing w:after="120" w:line="300"/>
+            </w:pPr>
+            <w:r>
+              <w:t xml:space="preserve">The Java Virtual Machine, or JVM, reads the class file.</w:t>
             </w:r>
           </w:p>
           <w:p>
@@ -4345,7 +4481,7 @@
                 <w:sz w:val="18"/>
                 <w:szCs w:val="18"/>
               </w:rPr>
-              <w:t xml:space="preserve">java Greeting</w:t>
+              <w:t xml:space="preserve">java Message</w:t>
             </w:r>
           </w:p>
         </w:tc>
@@ -4403,34 +4539,34 @@
                 <w:bCs/>
                 <w:color w:val="263A67"/>
               </w:rPr>
-              <w:t xml:space="preserve">Visible result</w:t>
-            </w:r>
-          </w:p>
-          <w:p>
-            <w:pPr>
-              <w:spacing w:after="120" w:line="300"/>
-            </w:pPr>
-            <w:r>
-              <w:rPr>
-                <w:b/>
-                <w:bCs/>
-              </w:rPr>
-              <w:t xml:space="preserve">Artifact: </w:t>
+              <w:t xml:space="preserve">We see</w:t>
+            </w:r>
+          </w:p>
+          <w:p>
+            <w:pPr>
+              <w:spacing w:after="120" w:line="300"/>
+            </w:pPr>
+            <w:r>
+              <w:rPr>
+                <w:b/>
+                <w:bCs/>
+              </w:rPr>
+              <w:t xml:space="preserve">What we have now: </w:t>
             </w:r>
             <w:r>
               <w:rPr>
                 <w:rFonts w:ascii="Consolas" w:cs="Consolas" w:eastAsia="Consolas" w:hAnsi="Consolas"/>
                 <w:color w:val="4659A7"/>
               </w:rPr>
-              <w:t xml:space="preserve">stdout</w:t>
-            </w:r>
-          </w:p>
-          <w:p>
-            <w:pPr>
-              <w:spacing w:after="120" w:line="300"/>
-            </w:pPr>
-            <w:r>
-              <w:t xml:space="preserve">The JVM works with the operating system to display the message.</w:t>
+              <w:t xml:space="preserve">Hello</w:t>
+            </w:r>
+          </w:p>
+          <w:p>
+            <w:pPr>
+              <w:spacing w:after="120" w:line="300"/>
+            </w:pPr>
+            <w:r>
+              <w:t xml:space="preserve">The message reaches the screen.</w:t>
             </w:r>
           </w:p>
           <w:p>
@@ -4446,70 +4582,6 @@
                 <w:szCs w:val="18"/>
               </w:rPr>
               <w:t xml:space="preserve">Hello</w:t>
-            </w:r>
-          </w:p>
-        </w:tc>
-      </w:tr>
-    </w:tbl>
-    <w:tbl>
-      <w:tblPr>
-        <w:tblW w:type="pct" w:w="100%"/>
-        <w:tblBorders>
-          <w:top w:val="single" w:color="auto" w:sz="4"/>
-          <w:left w:val="single" w:color="auto" w:sz="4"/>
-          <w:bottom w:val="single" w:color="auto" w:sz="4"/>
-          <w:right w:val="single" w:color="auto" w:sz="4"/>
-          <w:insideH w:val="single" w:color="auto" w:sz="4"/>
-          <w:insideV w:val="single" w:color="auto" w:sz="4"/>
-        </w:tblBorders>
-      </w:tblPr>
-      <w:tblGrid>
-        <w:gridCol w:w="100"/>
-      </w:tblGrid>
-      <w:tr>
-        <w:tc>
-          <w:tcPr>
-            <w:tcBorders>
-              <w:top w:val="single" w:color="D9E0EA" w:sz="2"/>
-              <w:left w:val="single" w:color="D9E0EA" w:sz="2"/>
-              <w:bottom w:val="single" w:color="D9E0EA" w:sz="2"/>
-              <w:right w:val="single" w:color="D9E0EA" w:sz="2"/>
-            </w:tcBorders>
-            <w:shd w:fill="F2F4FA" w:val="clear"/>
-            <w:tcMar>
-              <w:top w:type="dxa" w:w="130"/>
-              <w:left w:type="dxa" w:w="160"/>
-              <w:bottom w:type="dxa" w:w="130"/>
-              <w:right w:type="dxa" w:w="160"/>
-            </w:tcMar>
-          </w:tcPr>
-          <w:p>
-            <w:pPr>
-              <w:spacing w:after="120" w:line="300"/>
-            </w:pPr>
-            <w:r>
-              <w:rPr>
-                <w:b/>
-                <w:bCs/>
-                <w:color w:val="263A67"/>
-              </w:rPr>
-              <w:t xml:space="preserve">An honest accuracy note</w:t>
-            </w:r>
-          </w:p>
-          <w:p>
-            <w:pPr>
-              <w:spacing w:after="120" w:line="300"/>
-            </w:pPr>
-            <w:r>
-              <w:t xml:space="preserve">“Compiled” and “interpreted” are not two sealed boxes. CPython compiles source to bytecode. Modern JVMs can compile bytecode to native code while a program runs. C compilers may combine or optimise stages.</w:t>
-            </w:r>
-          </w:p>
-          <w:p>
-            <w:pPr>
-              <w:spacing w:after="120" w:line="300"/>
-            </w:pPr>
-            <w:r>
-              <w:t xml:space="preserve">The routes above are useful maps, not photographs of every internal detail.</w:t>
             </w:r>
           </w:p>
         </w:tc>
@@ -4570,7 +4642,7 @@
                 <w:bCs/>
                 <w:color w:val="168A8A"/>
               </w:rPr>
-              <w:t xml:space="preserve">The language is not the processor. A toolchain is the bridge between the code we understand and the operations the machine performs.</w:t>
+              <w:t xml:space="preserve">Our code does not jump straight into the processor. A language tool helps it cross the gap.</w:t>
             </w:r>
           </w:p>
         </w:tc>
@@ -4588,38 +4660,118 @@
           <w:bCs/>
           <w:color w:val="4659A7"/>
         </w:rPr>
-        <w:t xml:space="preserve">Open Python’s hidden instruction list</w:t>
-      </w:r>
-    </w:p>
-    <w:p>
-      <w:pPr>
-        <w:spacing w:after="120" w:line="300"/>
-      </w:pPr>
-      <w:r>
-        <w:t xml:space="preserve">CPython includes </w:t>
-      </w:r>
-      <w:r>
-        <w:rPr>
-          <w:rFonts w:ascii="Consolas" w:cs="Consolas" w:eastAsia="Consolas" w:hAnsi="Consolas"/>
-          <w:color w:val="4659A7"/>
-          <w:shd w:fill="EEF1FA" w:val="clear"/>
-        </w:rPr>
-        <w:t xml:space="preserve">dis</w:t>
-      </w:r>
-      <w:r>
-        <w:t xml:space="preserve">, a </w:t>
-      </w:r>
-      <w:r>
-        <w:rPr>
-          <w:b/>
-          <w:bCs/>
-        </w:rPr>
-        <w:t xml:space="preserve">disassembler</w:t>
-      </w:r>
-      <w:r>
-        <w:t xml:space="preserve">—a tool that shows bytecode in a readable form. The exact instructions can change between Python versions. That is fine. We are looking for evidence that a hidden stage exists.</w:t>
-      </w:r>
-    </w:p>
+        <w:t xml:space="preserve">The new words, in plain English</w:t>
+      </w:r>
+    </w:p>
+    <w:tbl>
+      <w:tblPr>
+        <w:tblW w:type="pct" w:w="100%"/>
+        <w:tblBorders>
+          <w:top w:val="single" w:color="auto" w:sz="4"/>
+          <w:left w:val="single" w:color="auto" w:sz="4"/>
+          <w:bottom w:val="single" w:color="auto" w:sz="4"/>
+          <w:right w:val="single" w:color="auto" w:sz="4"/>
+          <w:insideH w:val="single" w:color="auto" w:sz="4"/>
+          <w:insideV w:val="single" w:color="auto" w:sz="4"/>
+        </w:tblBorders>
+      </w:tblPr>
+      <w:tblGrid>
+        <w:gridCol w:w="100"/>
+      </w:tblGrid>
+      <w:tr>
+        <w:tc>
+          <w:tcPr>
+            <w:tcBorders>
+              <w:top w:val="single" w:color="D9E0EA" w:sz="2"/>
+              <w:left w:val="single" w:color="D9E0EA" w:sz="2"/>
+              <w:bottom w:val="single" w:color="D9E0EA" w:sz="2"/>
+              <w:right w:val="single" w:color="D9E0EA" w:sz="2"/>
+            </w:tcBorders>
+            <w:shd w:fill="F2F4FA" w:val="clear"/>
+            <w:tcMar>
+              <w:top w:type="dxa" w:w="130"/>
+              <w:left w:type="dxa" w:w="160"/>
+              <w:bottom w:type="dxa" w:w="130"/>
+              <w:right w:type="dxa" w:w="160"/>
+            </w:tcMar>
+          </w:tcPr>
+          <w:p>
+            <w:pPr>
+              <w:spacing w:after="120" w:line="300"/>
+            </w:pPr>
+            <w:r>
+              <w:rPr>
+                <w:b/>
+                <w:bCs/>
+                <w:color w:val="263A67"/>
+              </w:rPr>
+              <w:t xml:space="preserve">Four labels worth recognising</w:t>
+            </w:r>
+          </w:p>
+          <w:p>
+            <w:pPr>
+              <w:spacing w:after="120" w:line="300"/>
+            </w:pPr>
+            <w:r>
+              <w:t xml:space="preserve">A </w:t>
+            </w:r>
+            <w:r>
+              <w:rPr>
+                <w:b/>
+                <w:bCs/>
+              </w:rPr>
+              <w:t xml:space="preserve">compiler</w:t>
+            </w:r>
+            <w:r>
+              <w:t xml:space="preserve"> is a translator that prepares code. A </w:t>
+            </w:r>
+            <w:r>
+              <w:rPr>
+                <w:b/>
+                <w:bCs/>
+              </w:rPr>
+              <w:t xml:space="preserve">linker</w:t>
+            </w:r>
+            <w:r>
+              <w:t xml:space="preserve"> is a joiner that connects prepared pieces.</w:t>
+            </w:r>
+          </w:p>
+          <w:p>
+            <w:pPr>
+              <w:spacing w:after="120" w:line="300"/>
+            </w:pPr>
+            <w:r>
+              <w:rPr>
+                <w:b/>
+                <w:bCs/>
+              </w:rPr>
+              <w:t xml:space="preserve">Bytecode</w:t>
+            </w:r>
+            <w:r>
+              <w:t xml:space="preserve"> is a simpler instruction format for a language helper. A </w:t>
+            </w:r>
+            <w:r>
+              <w:rPr>
+                <w:b/>
+                <w:bCs/>
+              </w:rPr>
+              <w:t xml:space="preserve">virtual machine</w:t>
+            </w:r>
+            <w:r>
+              <w:t xml:space="preserve"> is a program that runs those instructions. JVM means Java Virtual Machine.</w:t>
+            </w:r>
+          </w:p>
+          <w:p>
+            <w:pPr>
+              <w:spacing w:after="120" w:line="300"/>
+            </w:pPr>
+            <w:r>
+              <w:t xml:space="preserve">You do not need to memorise these words today. Return to the route pictures whenever you meet them again.</w:t>
+            </w:r>
+          </w:p>
+        </w:tc>
+      </w:tr>
+    </w:tbl>
     <w:p>
       <w:pPr>
         <w:pStyle w:val="Heading2"/>
@@ -4632,6 +4784,103 @@
           <w:bCs/>
           <w:color w:val="4659A7"/>
         </w:rPr>
+        <w:t xml:space="preserve">What happens in Python?</w:t>
+      </w:r>
+    </w:p>
+    <w:p>
+      <w:pPr>
+        <w:spacing w:after="120" w:line="300"/>
+      </w:pPr>
+      <w:r>
+        <w:t xml:space="preserve">The common Python program is called </w:t>
+      </w:r>
+      <w:r>
+        <w:rPr>
+          <w:b/>
+          <w:bCs/>
+        </w:rPr>
+        <w:t xml:space="preserve">CPython</w:t>
+      </w:r>
+      <w:r>
+        <w:t xml:space="preserve">. It first prepares smaller instructions called bytecode. Then its runtime carries out those instructions. This happens automatically when we run our file.</w:t>
+      </w:r>
+    </w:p>
+    <w:tbl>
+      <w:tblPr>
+        <w:tblW w:type="pct" w:w="100%"/>
+        <w:tblBorders>
+          <w:top w:val="single" w:color="auto" w:sz="4"/>
+          <w:left w:val="single" w:color="auto" w:sz="4"/>
+          <w:bottom w:val="single" w:color="auto" w:sz="4"/>
+          <w:right w:val="single" w:color="auto" w:sz="4"/>
+          <w:insideH w:val="single" w:color="auto" w:sz="4"/>
+          <w:insideV w:val="single" w:color="auto" w:sz="4"/>
+        </w:tblBorders>
+      </w:tblPr>
+      <w:tblGrid>
+        <w:gridCol w:w="100"/>
+      </w:tblGrid>
+      <w:tr>
+        <w:tc>
+          <w:tcPr>
+            <w:tcBorders>
+              <w:top w:val="single" w:color="D9E0EA" w:sz="2"/>
+              <w:left w:val="single" w:color="D9E0EA" w:sz="2"/>
+              <w:bottom w:val="single" w:color="D9E0EA" w:sz="2"/>
+              <w:right w:val="single" w:color="D9E0EA" w:sz="2"/>
+            </w:tcBorders>
+            <w:shd w:fill="EEF8F6" w:val="clear"/>
+            <w:tcMar>
+              <w:top w:type="dxa" w:w="130"/>
+              <w:left w:type="dxa" w:w="160"/>
+              <w:bottom w:type="dxa" w:w="130"/>
+              <w:right w:type="dxa" w:w="160"/>
+            </w:tcMar>
+          </w:tcPr>
+          <w:p>
+            <w:pPr>
+              <w:spacing w:after="120" w:line="300"/>
+            </w:pPr>
+            <w:r>
+              <w:rPr>
+                <w:b/>
+                <w:bCs/>
+                <w:color w:val="263A67"/>
+              </w:rPr>
+              <w:t xml:space="preserve">A rough draft behind the curtain</w:t>
+            </w:r>
+          </w:p>
+          <w:p>
+            <w:pPr>
+              <w:spacing w:after="120" w:line="300"/>
+            </w:pPr>
+            <w:r>
+              <w:t xml:space="preserve">We hand Python our readable file. Python makes an internal working version and uses it to run the program.</w:t>
+            </w:r>
+          </w:p>
+          <w:p>
+            <w:pPr>
+              <w:spacing w:after="120" w:line="300"/>
+            </w:pPr>
+            <w:r>
+              <w:t xml:space="preserve">We normally do not need to open that working version. Knowing it exists stops us from believing that the processor reads Python words directly.</w:t>
+            </w:r>
+          </w:p>
+        </w:tc>
+      </w:tr>
+    </w:tbl>
+    <w:p>
+      <w:pPr>
+        <w:pStyle w:val="Heading2"/>
+        <w:keepNext/>
+        <w:spacing w:after="100" w:before="240"/>
+      </w:pPr>
+      <w:r>
+        <w:rPr>
+          <w:b/>
+          <w:bCs/>
+          <w:color w:val="4659A7"/>
+        </w:rPr>
         <w:t xml:space="preserve">The code</w:t>
       </w:r>
     </w:p>
@@ -4646,7 +4895,7 @@
           <w:bCs/>
           <w:color w:val="4659A7"/>
         </w:rPr>
-        <w:t xml:space="preserve">greeting.py</w:t>
+        <w:t xml:space="preserve">message.py</w:t>
       </w:r>
     </w:p>
     <w:p>
@@ -4661,7 +4910,7 @@
           <w:sz w:val="19"/>
           <w:szCs w:val="19"/>
         </w:rPr>
-        <w:t xml:space="preserve"> 1  message = "Hello from the other side"</w:t>
+        <w:t xml:space="preserve"> 1  message = "Hello"</w:t>
       </w:r>
     </w:p>
     <w:p>
@@ -4720,7 +4969,7 @@
           <w:sz w:val="19"/>
           <w:szCs w:val="19"/>
         </w:rPr>
-        <w:t xml:space="preserve"> 1  $ python -m dis greeting.py</w:t>
+        <w:t xml:space="preserve"> 1  $ python message.py</w:t>
       </w:r>
     </w:p>
     <w:p>
@@ -4735,52 +4984,7 @@
           <w:sz w:val="19"/>
           <w:szCs w:val="19"/>
         </w:rPr>
-        <w:t xml:space="preserve"> 2  ... LOAD_CONST ...</w:t>
-      </w:r>
-    </w:p>
-    <w:p>
-      <w:pPr>
-        <w:keepLines/>
-        <w:shd w:fill="F4F6F9" w:val="clear"/>
-        <w:spacing w:after="0" w:line="260"/>
-      </w:pPr>
-      <w:r>
-        <w:rPr>
-          <w:rFonts w:ascii="Consolas" w:cs="Consolas" w:eastAsia="Consolas" w:hAnsi="Consolas"/>
-          <w:sz w:val="19"/>
-          <w:szCs w:val="19"/>
-        </w:rPr>
-        <w:t xml:space="preserve"> 3  ... STORE_NAME ...</w:t>
-      </w:r>
-    </w:p>
-    <w:p>
-      <w:pPr>
-        <w:keepLines/>
-        <w:shd w:fill="F4F6F9" w:val="clear"/>
-        <w:spacing w:after="0" w:line="260"/>
-      </w:pPr>
-      <w:r>
-        <w:rPr>
-          <w:rFonts w:ascii="Consolas" w:cs="Consolas" w:eastAsia="Consolas" w:hAnsi="Consolas"/>
-          <w:sz w:val="19"/>
-          <w:szCs w:val="19"/>
-        </w:rPr>
-        <w:t xml:space="preserve"> 4  ... CALL ...</w:t>
-      </w:r>
-    </w:p>
-    <w:p>
-      <w:pPr>
-        <w:keepLines/>
-        <w:shd w:fill="F4F6F9" w:val="clear"/>
-        <w:spacing w:after="0" w:line="260"/>
-      </w:pPr>
-      <w:r>
-        <w:rPr>
-          <w:rFonts w:ascii="Consolas" w:cs="Consolas" w:eastAsia="Consolas" w:hAnsi="Consolas"/>
-          <w:sz w:val="19"/>
-          <w:szCs w:val="19"/>
-        </w:rPr>
-        <w:t xml:space="preserve"> 5  ... RETURN_VALUE ...</w:t>
+        <w:t xml:space="preserve"> 2  Hello</w:t>
       </w:r>
     </w:p>
     <w:p>
@@ -4816,10 +5020,10 @@
           <w:color w:val="4659A7"/>
           <w:shd w:fill="EEF1FA" w:val="clear"/>
         </w:rPr>
-        <w:t xml:space="preserve">greeting.py</w:t>
-      </w:r>
-      <w:r>
-        <w:t xml:space="preserve"> with the two lines above.</w:t>
+        <w:t xml:space="preserve">message.py</w:t>
+      </w:r>
+      <w:r>
+        <w:t xml:space="preserve">.</w:t>
       </w:r>
     </w:p>
     <w:p>
@@ -4832,18 +5036,7 @@
         <w:spacing w:after="120" w:line="300"/>
       </w:pPr>
       <w:r>
-        <w:t xml:space="preserve">Run </w:t>
-      </w:r>
-      <w:r>
-        <w:rPr>
-          <w:rFonts w:ascii="Consolas" w:cs="Consolas" w:eastAsia="Consolas" w:hAnsi="Consolas"/>
-          <w:color w:val="4659A7"/>
-          <w:shd w:fill="EEF1FA" w:val="clear"/>
-        </w:rPr>
-        <w:t xml:space="preserve">python greeting.py</w:t>
-      </w:r>
-      <w:r>
-        <w:t xml:space="preserve"> and see the greeting.</w:t>
+        <w:t xml:space="preserve">Type the two lines above.</w:t>
       </w:r>
     </w:p>
     <w:p>
@@ -4856,18 +5049,7 @@
         <w:spacing w:after="120" w:line="300"/>
       </w:pPr>
       <w:r>
-        <w:t xml:space="preserve">Run </w:t>
-      </w:r>
-      <w:r>
-        <w:rPr>
-          <w:rFonts w:ascii="Consolas" w:cs="Consolas" w:eastAsia="Consolas" w:hAnsi="Consolas"/>
-          <w:color w:val="4659A7"/>
-          <w:shd w:fill="EEF1FA" w:val="clear"/>
-        </w:rPr>
-        <w:t xml:space="preserve">python -m dis greeting.py</w:t>
-      </w:r>
-      <w:r>
-        <w:t xml:space="preserve">.</w:t>
+        <w:t xml:space="preserve">Before running it, point to the Python route and say what each card means.</w:t>
       </w:r>
     </w:p>
     <w:p>
@@ -4880,7 +5062,7 @@
         <w:spacing w:after="120" w:line="300"/>
       </w:pPr>
       <w:r>
-        <w:t xml:space="preserve">Find an instruction containing </w:t>
+        <w:t xml:space="preserve">Run </w:t>
       </w:r>
       <w:r>
         <w:rPr>
@@ -4888,18 +5070,7 @@
           <w:color w:val="4659A7"/>
           <w:shd w:fill="EEF1FA" w:val="clear"/>
         </w:rPr>
-        <w:t xml:space="preserve">LOAD</w:t>
-      </w:r>
-      <w:r>
-        <w:t xml:space="preserve"> and one containing </w:t>
-      </w:r>
-      <w:r>
-        <w:rPr>
-          <w:rFonts w:ascii="Consolas" w:cs="Consolas" w:eastAsia="Consolas" w:hAnsi="Consolas"/>
-          <w:color w:val="4659A7"/>
-          <w:shd w:fill="EEF1FA" w:val="clear"/>
-        </w:rPr>
-        <w:t xml:space="preserve">CALL</w:t>
+        <w:t xml:space="preserve">python message.py</w:t>
       </w:r>
       <w:r>
         <w:t xml:space="preserve">.</w:t>
@@ -4915,7 +5086,7 @@
         <w:spacing w:after="120" w:line="300"/>
       </w:pPr>
       <w:r>
-        <w:t xml:space="preserve">Change the message. Run both commands again.</w:t>
+        <w:t xml:space="preserve">Change Hello to your name and run it again.</w:t>
       </w:r>
     </w:p>
     <w:tbl>
@@ -4968,18 +5139,7 @@
               <w:spacing w:after="120" w:line="300"/>
             </w:pPr>
             <w:r>
-              <w:t xml:space="preserve">Which route creates </w:t>
-            </w:r>
-            <w:r>
-              <w:rPr>
-                <w:rFonts w:ascii="Consolas" w:cs="Consolas" w:eastAsia="Consolas" w:hAnsi="Consolas"/>
-                <w:color w:val="4659A7"/>
-                <w:shd w:fill="EEF1FA" w:val="clear"/>
-              </w:rPr>
-              <w:t xml:space="preserve">Greeting.class</w:t>
-            </w:r>
-            <w:r>
-              <w:t xml:space="preserve"> before the program runs?</w:t>
+              <w:t xml:space="preserve">Which helper joins prepared C pieces into one runnable program?</w:t>
             </w:r>
           </w:p>
           <w:p>
@@ -4992,7 +5152,7 @@
               <w:spacing w:after="120" w:line="300"/>
             </w:pPr>
             <w:r>
-              <w:t xml:space="preserve">A. Python with CPython</w:t>
+              <w:t xml:space="preserve">A. The print function</w:t>
             </w:r>
           </w:p>
           <w:p>
@@ -5005,7 +5165,7 @@
               <w:spacing w:after="120" w:line="300"/>
             </w:pPr>
             <w:r>
-              <w:t xml:space="preserve">B. C with GCC</w:t>
+              <w:t xml:space="preserve">B. The linker</w:t>
             </w:r>
           </w:p>
           <w:p>
@@ -5018,22 +5178,22 @@
               <w:spacing w:after="120" w:line="300"/>
             </w:pPr>
             <w:r>
-              <w:t xml:space="preserve">C. Java with javac</w:t>
-            </w:r>
-          </w:p>
-          <w:p>
-            <w:pPr>
-              <w:spacing w:after="120" w:line="300"/>
-            </w:pPr>
-            <w:r>
-              <w:rPr>
-                <w:b/>
-                <w:bCs/>
-              </w:rPr>
-              <w:t xml:space="preserve">Answer: Java with javac. </w:t>
-            </w:r>
-            <w:r>
-              <w:t xml:space="preserve">javac compiles Java source into a class file containing Java bytecode.</w:t>
+              <w:t xml:space="preserve">C. The terminal</w:t>
+            </w:r>
+          </w:p>
+          <w:p>
+            <w:pPr>
+              <w:spacing w:after="120" w:line="300"/>
+            </w:pPr>
+            <w:r>
+              <w:rPr>
+                <w:b/>
+                <w:bCs/>
+              </w:rPr>
+              <w:t xml:space="preserve">Answer: The linker. </w:t>
+            </w:r>
+            <w:r>
+              <w:t xml:space="preserve">A linker joins the pieces needed by the final program.</w:t>
             </w:r>
           </w:p>
         </w:tc>
@@ -5089,7 +5249,7 @@
               <w:spacing w:after="120" w:line="300"/>
             </w:pPr>
             <w:r>
-              <w:t xml:space="preserve">Which statement hides an important truth?</w:t>
+              <w:t xml:space="preserve">Which sentence is incorrect?</w:t>
             </w:r>
           </w:p>
           <w:p>
@@ -5118,7 +5278,7 @@
                 <w:sz w:val="19"/>
                 <w:szCs w:val="19"/>
               </w:rPr>
-              <w:t xml:space="preserve"> 1  CPython can compile source to bytecode.</w:t>
+              <w:t xml:space="preserve"> 1  People can read Python source code.</w:t>
             </w:r>
           </w:p>
           <w:p>
@@ -5133,7 +5293,7 @@
                 <w:sz w:val="19"/>
                 <w:szCs w:val="19"/>
               </w:rPr>
-              <w:t xml:space="preserve"> 2  Python source runs directly inside the processor.</w:t>
+              <w:t xml:space="preserve"> 2  A processor directly understands Python words.</w:t>
             </w:r>
           </w:p>
           <w:p>
@@ -5148,7 +5308,7 @@
                 <w:sz w:val="19"/>
                 <w:szCs w:val="19"/>
               </w:rPr>
-              <w:t xml:space="preserve"> 3  A C linker can join object files and libraries.</w:t>
+              <w:t xml:space="preserve"> 3  Python helps perform our instructions.</w:t>
             </w:r>
           </w:p>
           <w:p>
@@ -5163,7 +5323,7 @@
               <w:t xml:space="preserve">Answer: line 2. </w:t>
             </w:r>
             <w:r>
-              <w:t xml:space="preserve">The processor does not read Python words directly. The Python runtime and lower-level system code stand in between.</w:t>
+              <w:t xml:space="preserve">A processor works with machine instructions. Python and lower-level tools bridge the gap.</w:t>
             </w:r>
           </w:p>
         </w:tc>
@@ -5226,15 +5386,15 @@
                 <w:bCs/>
                 <w:color w:val="263A67"/>
               </w:rPr>
-              <w:t xml:space="preserve">✗ Interpreted means never compiled</w:t>
-            </w:r>
-          </w:p>
-          <w:p>
-            <w:pPr>
-              <w:spacing w:after="120" w:line="300"/>
-            </w:pPr>
-            <w:r>
-              <w:t xml:space="preserve">CPython normally compiles source into bytecode before executing it.</w:t>
+              <w:t xml:space="preserve">✗ Python is the processor</w:t>
+            </w:r>
+          </w:p>
+          <w:p>
+            <w:pPr>
+              <w:spacing w:after="120" w:line="300"/>
+            </w:pPr>
+            <w:r>
+              <w:t xml:space="preserve">Python is a program running on the computer. It is not the hardware.</w:t>
             </w:r>
           </w:p>
         </w:tc>
@@ -5282,15 +5442,15 @@
                 <w:bCs/>
                 <w:color w:val="263A67"/>
               </w:rPr>
-              <w:t xml:space="preserve">✗ Bytecode is CPU machine code</w:t>
-            </w:r>
-          </w:p>
-          <w:p>
-            <w:pPr>
-              <w:spacing w:after="120" w:line="300"/>
-            </w:pPr>
-            <w:r>
-              <w:t xml:space="preserve">Bytecode targets a virtual machine or runtime, not a specific processor instruction set.</w:t>
+              <w:t xml:space="preserve">✗ Compiler means error checker only</w:t>
+            </w:r>
+          </w:p>
+          <w:p>
+            <w:pPr>
+              <w:spacing w:after="120" w:line="300"/>
+            </w:pPr>
+            <w:r>
+              <w:t xml:space="preserve">A compiler can check code and translate it into another form.</w:t>
             </w:r>
           </w:p>
         </w:tc>
@@ -5338,15 +5498,15 @@
                 <w:bCs/>
                 <w:color w:val="263A67"/>
               </w:rPr>
-              <w:t xml:space="preserve">✗ The compiler is the whole toolchain</w:t>
-            </w:r>
-          </w:p>
-          <w:p>
-            <w:pPr>
-              <w:spacing w:after="120" w:line="300"/>
-            </w:pPr>
-            <w:r>
-              <w:t xml:space="preserve">A real route can also include preprocessing, assembly, linking, loading and runtime work.</w:t>
+              <w:t xml:space="preserve">✗ Different route means different result</w:t>
+            </w:r>
+          </w:p>
+          <w:p>
+            <w:pPr>
+              <w:spacing w:after="120" w:line="300"/>
+            </w:pPr>
+            <w:r>
+              <w:t xml:space="preserve">These three routes can still produce the same visible Hello.</w:t>
             </w:r>
           </w:p>
         </w:tc>
@@ -5376,7 +5536,7 @@
           <w:b/>
           <w:bCs/>
         </w:rPr>
-        <w:t xml:space="preserve">1. What is an artifact?</w:t>
+        <w:t xml:space="preserve">1. Why do we need a language helper?</w:t>
       </w:r>
     </w:p>
     <w:p>
@@ -5392,19 +5552,19 @@
         <w:t xml:space="preserve">Answer: </w:t>
       </w:r>
       <w:r>
-        <w:t xml:space="preserve">A file or internal result created by a stage, such as an object file or bytecode.</w:t>
-      </w:r>
-    </w:p>
-    <w:p>
-      <w:pPr>
-        <w:spacing w:after="120" w:line="300"/>
-      </w:pPr>
-      <w:r>
-        <w:rPr>
-          <w:b/>
-          <w:bCs/>
-        </w:rPr>
-        <w:t xml:space="preserve">2. What does a linker do in the C route?</w:t>
+        <w:t xml:space="preserve">The processor does not directly understand our human-friendly source code.</w:t>
+      </w:r>
+    </w:p>
+    <w:p>
+      <w:pPr>
+        <w:spacing w:after="120" w:line="300"/>
+      </w:pPr>
+      <w:r>
+        <w:rPr>
+          <w:b/>
+          <w:bCs/>
+        </w:rPr>
+        <w:t xml:space="preserve">2. What does a compiler do in our simple picture?</w:t>
       </w:r>
     </w:p>
     <w:p>
@@ -5420,19 +5580,19 @@
         <w:t xml:space="preserve">Answer: </w:t>
       </w:r>
       <w:r>
-        <w:t xml:space="preserve">It combines object files and required library code into an executable.</w:t>
-      </w:r>
-    </w:p>
-    <w:p>
-      <w:pPr>
-        <w:spacing w:after="120" w:line="300"/>
-      </w:pPr>
-      <w:r>
-        <w:rPr>
-          <w:b/>
-          <w:bCs/>
-        </w:rPr>
-        <w:t xml:space="preserve">3. Why can Java bytecode travel between systems?</w:t>
+        <w:t xml:space="preserve">It translates source code into another form.</w:t>
+      </w:r>
+    </w:p>
+    <w:p>
+      <w:pPr>
+        <w:spacing w:after="120" w:line="300"/>
+      </w:pPr>
+      <w:r>
+        <w:rPr>
+          <w:b/>
+          <w:bCs/>
+        </w:rPr>
+        <w:t xml:space="preserve">3. What does a linker do?</w:t>
       </w:r>
     </w:p>
     <w:p>
@@ -5448,19 +5608,19 @@
         <w:t xml:space="preserve">Answer: </w:t>
       </w:r>
       <w:r>
-        <w:t xml:space="preserve">A JVM made for each system can run the shared class-file format.</w:t>
-      </w:r>
-    </w:p>
-    <w:p>
-      <w:pPr>
-        <w:spacing w:after="120" w:line="300"/>
-      </w:pPr>
-      <w:r>
-        <w:rPr>
-          <w:b/>
-          <w:bCs/>
-        </w:rPr>
-        <w:t xml:space="preserve">4. Is Python simply “not compiled”?</w:t>
+        <w:t xml:space="preserve">It joins prepared pieces into a runnable program.</w:t>
+      </w:r>
+    </w:p>
+    <w:p>
+      <w:pPr>
+        <w:spacing w:after="120" w:line="300"/>
+      </w:pPr>
+      <w:r>
+        <w:rPr>
+          <w:b/>
+          <w:bCs/>
+        </w:rPr>
+        <w:t xml:space="preserve">4. What does JVM mean?</w:t>
       </w:r>
     </w:p>
     <w:p>
@@ -5476,7 +5636,7 @@
         <w:t xml:space="preserve">Answer: </w:t>
       </w:r>
       <w:r>
-        <w:t xml:space="preserve">No. CPython normally compiles source into bytecode internally.</w:t>
+        <w:t xml:space="preserve">Java Virtual Machine, the program that runs Java class files.</w:t>
       </w:r>
     </w:p>
     <w:p>
@@ -5549,7 +5709,7 @@
               <w:spacing w:after="120" w:line="300"/>
             </w:pPr>
             <w:r>
-              <w:t xml:space="preserve">Source code is written for people; processors perform machine instructions.</w:t>
+              <w:t xml:space="preserve">We write source code for people.</w:t>
             </w:r>
           </w:p>
           <w:p>
@@ -5562,7 +5722,7 @@
               <w:spacing w:after="120" w:line="300"/>
             </w:pPr>
             <w:r>
-              <w:t xml:space="preserve">CPython prepares bytecode and executes it through a runtime.</w:t>
+              <w:t xml:space="preserve">A language tool bridges our code and the processor.</w:t>
             </w:r>
           </w:p>
           <w:p>
@@ -5575,7 +5735,7 @@
               <w:spacing w:after="120" w:line="300"/>
             </w:pPr>
             <w:r>
-              <w:t xml:space="preserve">A C toolchain can compile, assemble and link a native executable.</w:t>
+              <w:t xml:space="preserve">Python stays involved while a Python program runs.</w:t>
             </w:r>
           </w:p>
           <w:p>
@@ -5588,7 +5748,7 @@
               <w:spacing w:after="120" w:line="300"/>
             </w:pPr>
             <w:r>
-              <w:t xml:space="preserve">javac creates Java bytecode; a JVM runs and may JIT-compile it.</w:t>
+              <w:t xml:space="preserve">C usually builds a runnable program first.</w:t>
             </w:r>
           </w:p>
           <w:p>
@@ -5601,7 +5761,20 @@
               <w:spacing w:after="120" w:line="300"/>
             </w:pPr>
             <w:r>
-              <w:t xml:space="preserve">Simple diagrams are maps. Real implementations can optimise or combine stages.</w:t>
+              <w:t xml:space="preserve">Java builds a class file for a Java Virtual Machine.</w:t>
+            </w:r>
+          </w:p>
+          <w:p>
+            <w:pPr>
+              <w:pStyle w:val="ListParagraph"/>
+              <w:numPr>
+                <w:ilvl w:val="0"/>
+                <w:numId w:val="2"/>
+              </w:numPr>
+              <w:spacing w:after="120" w:line="300"/>
+            </w:pPr>
+            <w:r>
+              <w:t xml:space="preserve">Understanding the job matters more than memorising the label.</w:t>
             </w:r>
           </w:p>
         </w:tc>
@@ -5623,12 +5796,12 @@
       </w:r>
     </w:p>
     <w:p>
-      <w:hyperlink w:history="1" r:id="rId6vjgs7j68bt1dypfwoc4m">
+      <w:hyperlink w:history="1" r:id="rIdrwwtzewq54axzqul7qx3e">
         <w:r>
           <w:rPr>
             <w:rStyle w:val="Hyperlink"/>
           </w:rPr>
-          <w:t xml:space="preserve">Python `dis`: inspect CPython bytecode</w:t>
+          <w:t xml:space="preserve">Python FAQ: a short description of Python</w:t>
         </w:r>
       </w:hyperlink>
       <w:r>
@@ -5637,16 +5810,16 @@
           <w:sz w:val="18"/>
           <w:szCs w:val="18"/>
         </w:rPr>
-        <w:t xml:space="preserve"> — https://docs.python.org/3/library/dis.html</w:t>
-      </w:r>
-    </w:p>
-    <w:p>
-      <w:hyperlink w:history="1" r:id="rIdq5ke-2oahmqspcnczq5r6">
+        <w:t xml:space="preserve"> — https://docs.python.org/3/faq/general.html#what-is-python</w:t>
+      </w:r>
+    </w:p>
+    <w:p>
+      <w:hyperlink w:history="1" r:id="rId6fkxoog8tppyed6ib_2c0">
         <w:r>
           <w:rPr>
             <w:rStyle w:val="Hyperlink"/>
           </w:rPr>
-          <w:t xml:space="preserve">GCC: the four build stages</w:t>
+          <w:t xml:space="preserve">Python bytecode tool—save this for later</w:t>
         </w:r>
       </w:hyperlink>
       <w:r>
@@ -5655,16 +5828,16 @@
           <w:sz w:val="18"/>
           <w:szCs w:val="18"/>
         </w:rPr>
-        <w:t xml:space="preserve"> — https://gcc.gnu.org/onlinedocs/gcc/Overall-Options.html</w:t>
-      </w:r>
-    </w:p>
-    <w:p>
-      <w:hyperlink w:history="1" r:id="rIdoautgk75010cmwybdem6k">
+        <w:t xml:space="preserve"> — https://docs.python.org/3/library/dis.html</w:t>
+      </w:r>
+    </w:p>
+    <w:p>
+      <w:hyperlink w:history="1" r:id="rIdbilgu6dqefanzg6dgyx93">
         <w:r>
           <w:rPr>
             <w:rStyle w:val="Hyperlink"/>
           </w:rPr>
-          <w:t xml:space="preserve">Oracle `javac`: source to bytecode class files</w:t>
+          <w:t xml:space="preserve">GCC build stages—reference for later</w:t>
         </w:r>
       </w:hyperlink>
       <w:r>
@@ -5673,7 +5846,7 @@
           <w:sz w:val="18"/>
           <w:szCs w:val="18"/>
         </w:rPr>
-        <w:t xml:space="preserve"> — https://docs.oracle.com/en/java/javase/11/tools/javac.html</w:t>
+        <w:t xml:space="preserve"> — https://gcc.gnu.org/onlinedocs/gcc/Overall-Options.html</w:t>
       </w:r>
     </w:p>
     <w:tbl>
@@ -5718,15 +5891,15 @@
                 <w:bCs/>
                 <w:color w:val="263A67"/>
               </w:rPr>
-              <w:t xml:space="preserve">NEXT DISCOVERY · The route can run code—but where does data wait?</w:t>
-            </w:r>
-          </w:p>
-          <w:p>
-            <w:pPr>
-              <w:spacing w:after="120" w:line="300"/>
-            </w:pPr>
-            <w:r>
-              <w:t xml:space="preserve">Next, we give a value a name and watch Python’s memory change one line at a time.</w:t>
+              <w:t xml:space="preserve">NEXT DISCOVERY · The program can run—but where does it keep a score?</w:t>
+            </w:r>
+          </w:p>
+          <w:p>
+            <w:pPr>
+              <w:spacing w:after="120" w:line="300"/>
+            </w:pPr>
+            <w:r>
+              <w:t xml:space="preserve">Next, we give a value a name and watch Python remember it.</w:t>
             </w:r>
           </w:p>
         </w:tc>
@@ -7416,7 +7589,7 @@
       </w:r>
     </w:p>
     <w:p>
-      <w:hyperlink w:history="1" r:id="rIdsd69miasmapled-ccfq5a">
+      <w:hyperlink w:history="1" r:id="rIdrp0jlbnbtcw0bdy95qhq3">
         <w:r>
           <w:rPr>
             <w:rStyle w:val="Hyperlink"/>
@@ -7434,7 +7607,7 @@
       </w:r>
     </w:p>
     <w:p>
-      <w:hyperlink w:history="1" r:id="rId8iod0dlt3fupvdxdkys1z">
+      <w:hyperlink w:history="1" r:id="rIdd4rc0k1gcrhv__14rwetk">
         <w:r>
           <w:rPr>
             <w:rStyle w:val="Hyperlink"/>
@@ -9814,7 +9987,7 @@
       </w:r>
     </w:p>
     <w:p>
-      <w:hyperlink w:history="1" r:id="rIdpanikz1b7utyzdq5ox1pk">
+      <w:hyperlink w:history="1" r:id="rIdjgi43b16cqv7vd52rqxhw">
         <w:r>
           <w:rPr>
             <w:rStyle w:val="Hyperlink"/>

</xml_diff>

<commit_message>
Force every chapter onto a fresh book page
Co-authored-by: arena-agent <297053741+arena-agent@users.noreply.github.com>
</commit_message>
<xml_diff>
--- a/public/Akshat-EBooks-Python-for-Absolute-Beginners.docx
+++ b/public/Akshat-EBooks-Python-for-Absolute-Beginners.docx
@@ -557,7 +557,7 @@
       </w:r>
     </w:p>
     <w:p>
-      <w:hyperlink w:history="1" r:id="rIdogahbn1cbzk0akazbdzl5">
+      <w:hyperlink w:history="1" r:id="rIdadrnkmnkpazh21mrukzel">
         <w:r>
           <w:rPr>
             <w:rStyle w:val="Hyperlink"/>
@@ -575,7 +575,7 @@
       </w:r>
     </w:p>
     <w:p>
-      <w:hyperlink w:history="1" r:id="rIdljvc2xc5weebipgkxyhte">
+      <w:hyperlink w:history="1" r:id="rId7wd18acmli180skgb-ryu">
         <w:r>
           <w:rPr>
             <w:rStyle w:val="Hyperlink"/>
@@ -2620,7 +2620,7 @@
       </w:r>
     </w:p>
     <w:p>
-      <w:hyperlink w:history="1" r:id="rIdwsfje3saqojwsq7xk6tsm">
+      <w:hyperlink w:history="1" r:id="rIdv2b5uc0wbpiqqjbinqvda">
         <w:r>
           <w:rPr>
             <w:rStyle w:val="Hyperlink"/>
@@ -2638,7 +2638,7 @@
       </w:r>
     </w:p>
     <w:p>
-      <w:hyperlink w:history="1" r:id="rIdi4fyvnz6rwr8jnbwkxsxi">
+      <w:hyperlink w:history="1" r:id="rIdkqsrsxivitcsw-4xkqlqr">
         <w:r>
           <w:rPr>
             <w:rStyle w:val="Hyperlink"/>
@@ -5796,7 +5796,7 @@
       </w:r>
     </w:p>
     <w:p>
-      <w:hyperlink w:history="1" r:id="rIdrwwtzewq54axzqul7qx3e">
+      <w:hyperlink w:history="1" r:id="rIdhkovvv94zjb60nasxsu9m">
         <w:r>
           <w:rPr>
             <w:rStyle w:val="Hyperlink"/>
@@ -5814,7 +5814,7 @@
       </w:r>
     </w:p>
     <w:p>
-      <w:hyperlink w:history="1" r:id="rId6fkxoog8tppyed6ib_2c0">
+      <w:hyperlink w:history="1" r:id="rIdkyfmkiupn7phbvxbtjhsg">
         <w:r>
           <w:rPr>
             <w:rStyle w:val="Hyperlink"/>
@@ -5832,7 +5832,7 @@
       </w:r>
     </w:p>
     <w:p>
-      <w:hyperlink w:history="1" r:id="rIdbilgu6dqefanzg6dgyx93">
+      <w:hyperlink w:history="1" r:id="rIdf-oz4yeuy_aft_kzlcljy">
         <w:r>
           <w:rPr>
             <w:rStyle w:val="Hyperlink"/>
@@ -7589,7 +7589,7 @@
       </w:r>
     </w:p>
     <w:p>
-      <w:hyperlink w:history="1" r:id="rIdrp0jlbnbtcw0bdy95qhq3">
+      <w:hyperlink w:history="1" r:id="rIdt7n39gszynenhzo6khid1">
         <w:r>
           <w:rPr>
             <w:rStyle w:val="Hyperlink"/>
@@ -7607,7 +7607,7 @@
       </w:r>
     </w:p>
     <w:p>
-      <w:hyperlink w:history="1" r:id="rIdd4rc0k1gcrhv__14rwetk">
+      <w:hyperlink w:history="1" r:id="rIdbfmdt8pasiqbf9pfxfdhq">
         <w:r>
           <w:rPr>
             <w:rStyle w:val="Hyperlink"/>
@@ -9987,7 +9987,7 @@
       </w:r>
     </w:p>
     <w:p>
-      <w:hyperlink w:history="1" r:id="rIdjgi43b16cqv7vd52rqxhw">
+      <w:hyperlink w:history="1" r:id="rIdi5a-o0rkyi9xdn8l1kkrz">
         <w:r>
           <w:rPr>
             <w:rStyle w:val="Hyperlink"/>

</xml_diff>

<commit_message>
Add visual explanations at key learning moments
Co-authored-by: arena-agent <297053741+arena-agent@users.noreply.github.com>
</commit_message>
<xml_diff>
--- a/public/Akshat-EBooks-Python-for-Absolute-Beginners.docx
+++ b/public/Akshat-EBooks-Python-for-Absolute-Beginners.docx
@@ -557,7 +557,7 @@
       </w:r>
     </w:p>
     <w:p>
-      <w:hyperlink w:history="1" r:id="rIdadrnkmnkpazh21mrukzel">
+      <w:hyperlink w:history="1" r:id="rIdrdz3tjibv0l4g3bejmnwm">
         <w:r>
           <w:rPr>
             <w:rStyle w:val="Hyperlink"/>
@@ -575,7 +575,7 @@
       </w:r>
     </w:p>
     <w:p>
-      <w:hyperlink w:history="1" r:id="rId7wd18acmli180skgb-ryu">
+      <w:hyperlink w:history="1" r:id="rIdu0k3rftkwdbympyxoot10">
         <w:r>
           <w:rPr>
             <w:rStyle w:val="Hyperlink"/>
@@ -1023,6 +1023,67 @@
     </w:p>
     <w:p>
       <w:pPr>
+        <w:jc w:val="center"/>
+      </w:pPr>
+      <w:r>
+        <w:drawing>
+          <wp:inline distT="0" distB="0" distL="0" distR="0">
+            <wp:extent cx="5334000" cy="3552825"/>
+            <wp:effectExtent t="0" r="0" b="0" l="0"/>
+            <wp:docPr id="1" name="Numbered callouts identify the function name, brackets, quotes and text value in print(&quot;Hello&quot;)." descr="Numbered callouts identify the function name, brackets, quotes and text value in print(&quot;Hello&quot;)." title="Numbered callouts identify the function name, brackets, quotes and text value in print(&quot;Hello&quot;)."/>
+            <wp:cNvGraphicFramePr>
+              <a:graphicFrameLocks xmlns:a="http://schemas.openxmlformats.org/drawingml/2006/main" noChangeAspect="1"/>
+            </wp:cNvGraphicFramePr>
+            <a:graphic xmlns:a="http://schemas.openxmlformats.org/drawingml/2006/main">
+              <a:graphicData uri="http://schemas.openxmlformats.org/drawingml/2006/picture">
+                <pic:pic xmlns:pic="http://schemas.openxmlformats.org/drawingml/2006/picture">
+                  <pic:nvPicPr>
+                    <pic:cNvPr id="0" name="" descr=""/>
+                    <pic:cNvPicPr>
+                      <a:picLocks noChangeAspect="1" noChangeArrowheads="1"/>
+                    </pic:cNvPicPr>
+                  </pic:nvPicPr>
+                  <pic:blipFill>
+                    <a:blip r:embed="rId11" cstate="none"/>
+                    <a:srcRect/>
+                    <a:stretch>
+                      <a:fillRect/>
+                    </a:stretch>
+                  </pic:blipFill>
+                  <pic:spPr bwMode="auto">
+                    <a:xfrm>
+                      <a:off x="0" y="0"/>
+                      <a:ext cx="5334000" cy="3552825"/>
+                    </a:xfrm>
+                    <a:prstGeom prst="rect">
+                      <a:avLst/>
+                    </a:prstGeom>
+                  </pic:spPr>
+                </pic:pic>
+              </a:graphicData>
+            </a:graphic>
+          </wp:inline>
+        </w:drawing>
+      </w:r>
+    </w:p>
+    <w:p>
+      <w:pPr>
+        <w:spacing w:after="120" w:line="300"/>
+        <w:jc w:val="center"/>
+      </w:pPr>
+      <w:r>
+        <w:rPr>
+          <w:i/>
+          <w:iCs/>
+          <w:color w:val="5B6575"/>
+          <w:sz w:val="19"/>
+          <w:szCs w:val="19"/>
+        </w:rPr>
+        <w:t xml:space="preserve">Legend: 1 = print is the ready-made action. 2 = the brackets call it. 3 = quotes mark the text boundary. 4 = Hello is the value passed into the action.</w:t>
+      </w:r>
+    </w:p>
+    <w:p>
+      <w:pPr>
         <w:pStyle w:val="Heading2"/>
         <w:keepNext/>
         <w:spacing w:after="100" w:before="240"/>
@@ -2620,7 +2681,7 @@
       </w:r>
     </w:p>
     <w:p>
-      <w:hyperlink w:history="1" r:id="rIdv2b5uc0wbpiqqjbinqvda">
+      <w:hyperlink w:history="1" r:id="rIdtrkk1-52-dmbrmifkntba">
         <w:r>
           <w:rPr>
             <w:rStyle w:val="Hyperlink"/>
@@ -2638,7 +2699,7 @@
       </w:r>
     </w:p>
     <w:p>
-      <w:hyperlink w:history="1" r:id="rIdkqsrsxivitcsw-4xkqlqr">
+      <w:hyperlink w:history="1" r:id="rIdqzcu4nxsm4jjbzrdbvp4a">
         <w:r>
           <w:rPr>
             <w:rStyle w:val="Hyperlink"/>
@@ -2761,7 +2822,7 @@
                     </pic:cNvPicPr>
                   </pic:nvPicPr>
                   <pic:blipFill>
-                    <a:blip r:embed="rId11" cstate="none"/>
+                    <a:blip r:embed="rId12" cstate="none"/>
                     <a:srcRect/>
                     <a:stretch>
                       <a:fillRect/>
@@ -3131,6 +3192,67 @@
         <w:t xml:space="preserve">.</w:t>
       </w:r>
     </w:p>
+    <w:p>
+      <w:pPr>
+        <w:jc w:val="center"/>
+      </w:pPr>
+      <w:r>
+        <w:drawing>
+          <wp:inline distT="0" distB="0" distL="0" distR="0">
+            <wp:extent cx="5334000" cy="3552825"/>
+            <wp:effectExtent t="0" r="0" b="0" l="0"/>
+            <wp:docPr id="1" name="Four numbered stages show a Python file being checked, changed into smaller instructions and run to display Hello." descr="Four numbered stages show a Python file being checked, changed into smaller instructions and run to display Hello." title="Four numbered stages show a Python file being checked, changed into smaller instructions and run to display Hello."/>
+            <wp:cNvGraphicFramePr>
+              <a:graphicFrameLocks xmlns:a="http://schemas.openxmlformats.org/drawingml/2006/main" noChangeAspect="1"/>
+            </wp:cNvGraphicFramePr>
+            <a:graphic xmlns:a="http://schemas.openxmlformats.org/drawingml/2006/main">
+              <a:graphicData uri="http://schemas.openxmlformats.org/drawingml/2006/picture">
+                <pic:pic xmlns:pic="http://schemas.openxmlformats.org/drawingml/2006/picture">
+                  <pic:nvPicPr>
+                    <pic:cNvPr id="0" name="" descr=""/>
+                    <pic:cNvPicPr>
+                      <a:picLocks noChangeAspect="1" noChangeArrowheads="1"/>
+                    </pic:cNvPicPr>
+                  </pic:nvPicPr>
+                  <pic:blipFill>
+                    <a:blip r:embed="rId13" cstate="none"/>
+                    <a:srcRect/>
+                    <a:stretch>
+                      <a:fillRect/>
+                    </a:stretch>
+                  </pic:blipFill>
+                  <pic:spPr bwMode="auto">
+                    <a:xfrm>
+                      <a:off x="0" y="0"/>
+                      <a:ext cx="5334000" cy="3552825"/>
+                    </a:xfrm>
+                    <a:prstGeom prst="rect">
+                      <a:avLst/>
+                    </a:prstGeom>
+                  </pic:spPr>
+                </pic:pic>
+              </a:graphicData>
+            </a:graphic>
+          </wp:inline>
+        </w:drawing>
+      </w:r>
+    </w:p>
+    <w:p>
+      <w:pPr>
+        <w:spacing w:after="120" w:line="300"/>
+        <w:jc w:val="center"/>
+      </w:pPr>
+      <w:r>
+        <w:rPr>
+          <w:i/>
+          <w:iCs/>
+          <w:color w:val="5B6575"/>
+          <w:sz w:val="19"/>
+          <w:szCs w:val="19"/>
+        </w:rPr>
+        <w:t xml:space="preserve">Python route legend: 1 = our source file. 2 = Python checks its rules. 3 = Python prepares smaller internal instructions. 4 = the runtime performs them and Hello reaches the terminal.</w:t>
+      </w:r>
+    </w:p>
     <w:tbl>
       <w:tblPr>
         <w:tblW w:type="pct" w:w="100%"/>
@@ -5796,7 +5918,7 @@
       </w:r>
     </w:p>
     <w:p>
-      <w:hyperlink w:history="1" r:id="rIdhkovvv94zjb60nasxsu9m">
+      <w:hyperlink w:history="1" r:id="rIdyfaektd26kebf97mmbdlw">
         <w:r>
           <w:rPr>
             <w:rStyle w:val="Hyperlink"/>
@@ -5814,7 +5936,7 @@
       </w:r>
     </w:p>
     <w:p>
-      <w:hyperlink w:history="1" r:id="rIdkyfmkiupn7phbvxbtjhsg">
+      <w:hyperlink w:history="1" r:id="rIdgwlodruffyj50p_v6xkgb">
         <w:r>
           <w:rPr>
             <w:rStyle w:val="Hyperlink"/>
@@ -5832,7 +5954,7 @@
       </w:r>
     </w:p>
     <w:p>
-      <w:hyperlink w:history="1" r:id="rIdf-oz4yeuy_aft_kzlcljy">
+      <w:hyperlink w:history="1" r:id="rIdxbyvekv-bmuro0x5kmuko">
         <w:r>
           <w:rPr>
             <w:rStyle w:val="Hyperlink"/>
@@ -5955,7 +6077,7 @@
                     </pic:cNvPicPr>
                   </pic:nvPicPr>
                   <pic:blipFill>
-                    <a:blip r:embed="rId12" cstate="none"/>
+                    <a:blip r:embed="rId14" cstate="none"/>
                     <a:srcRect/>
                     <a:stretch>
                       <a:fillRect/>
@@ -6302,6 +6424,67 @@
         <w:t xml:space="preserve">, Python finishes the right side first. It reads the current value 10. It calculates 10 + 5. Only then does it assign the result 15 back to the name score.</w:t>
       </w:r>
     </w:p>
+    <w:p>
+      <w:pPr>
+        <w:jc w:val="center"/>
+      </w:pPr>
+      <w:r>
+        <w:drawing>
+          <wp:inline distT="0" distB="0" distL="0" distR="0">
+            <wp:extent cx="5334000" cy="3552825"/>
+            <wp:effectExtent t="0" r="0" b="0" l="0"/>
+            <wp:docPr id="1" name="Three numbered stages show score being read as 10, increased by 5 and assigned the result 15." descr="Three numbered stages show score being read as 10, increased by 5 and assigned the result 15." title="Three numbered stages show score being read as 10, increased by 5 and assigned the result 15."/>
+            <wp:cNvGraphicFramePr>
+              <a:graphicFrameLocks xmlns:a="http://schemas.openxmlformats.org/drawingml/2006/main" noChangeAspect="1"/>
+            </wp:cNvGraphicFramePr>
+            <a:graphic xmlns:a="http://schemas.openxmlformats.org/drawingml/2006/main">
+              <a:graphicData uri="http://schemas.openxmlformats.org/drawingml/2006/picture">
+                <pic:pic xmlns:pic="http://schemas.openxmlformats.org/drawingml/2006/picture">
+                  <pic:nvPicPr>
+                    <pic:cNvPr id="0" name="" descr=""/>
+                    <pic:cNvPicPr>
+                      <a:picLocks noChangeAspect="1" noChangeArrowheads="1"/>
+                    </pic:cNvPicPr>
+                  </pic:nvPicPr>
+                  <pic:blipFill>
+                    <a:blip r:embed="rId15" cstate="none"/>
+                    <a:srcRect/>
+                    <a:stretch>
+                      <a:fillRect/>
+                    </a:stretch>
+                  </pic:blipFill>
+                  <pic:spPr bwMode="auto">
+                    <a:xfrm>
+                      <a:off x="0" y="0"/>
+                      <a:ext cx="5334000" cy="3552825"/>
+                    </a:xfrm>
+                    <a:prstGeom prst="rect">
+                      <a:avLst/>
+                    </a:prstGeom>
+                  </pic:spPr>
+                </pic:pic>
+              </a:graphicData>
+            </a:graphic>
+          </wp:inline>
+        </w:drawing>
+      </w:r>
+    </w:p>
+    <w:p>
+      <w:pPr>
+        <w:spacing w:after="120" w:line="300"/>
+        <w:jc w:val="center"/>
+      </w:pPr>
+      <w:r>
+        <w:rPr>
+          <w:i/>
+          <w:iCs/>
+          <w:color w:val="5B6575"/>
+          <w:sz w:val="19"/>
+          <w:szCs w:val="19"/>
+        </w:rPr>
+        <w:t xml:space="preserve">Read the picture from right to left: 1 = read the current score, 10. 2 = calculate 10 + 5 to get 15. 3 = assign 15 back to the name score.</w:t>
+      </w:r>
+    </w:p>
     <w:tbl>
       <w:tblPr>
         <w:tblW w:type="pct" w:w="100%"/>
@@ -7589,7 +7772,7 @@
       </w:r>
     </w:p>
     <w:p>
-      <w:hyperlink w:history="1" r:id="rIdt7n39gszynenhzo6khid1">
+      <w:hyperlink w:history="1" r:id="rIdkhssn2wxx8l_nhgjk6kll">
         <w:r>
           <w:rPr>
             <w:rStyle w:val="Hyperlink"/>
@@ -7607,7 +7790,7 @@
       </w:r>
     </w:p>
     <w:p>
-      <w:hyperlink w:history="1" r:id="rIdbfmdt8pasiqbf9pfxfdhq">
+      <w:hyperlink w:history="1" r:id="rId0mre6hu3phoxn8jjfjsc-">
         <w:r>
           <w:rPr>
             <w:rStyle w:val="Hyperlink"/>
@@ -7730,7 +7913,7 @@
                     </pic:cNvPicPr>
                   </pic:nvPicPr>
                   <pic:blipFill>
-                    <a:blip r:embed="rId13" cstate="none"/>
+                    <a:blip r:embed="rId16" cstate="none"/>
                     <a:srcRect/>
                     <a:stretch>
                       <a:fillRect/>
@@ -8184,6 +8367,67 @@
         <w:t xml:space="preserve"> symbol enough context to choose the operation.</w:t>
       </w:r>
     </w:p>
+    <w:p>
+      <w:pPr>
+        <w:jc w:val="center"/>
+      </w:pPr>
+      <w:r>
+        <w:drawing>
+          <wp:inline distT="0" distB="0" distL="0" distR="0">
+            <wp:extent cx="5334000" cy="3552825"/>
+            <wp:effectExtent t="0" r="0" b="0" l="0"/>
+            <wp:docPr id="1" name="Two lanes compare integer addition with string joining using the plus symbol." descr="Two lanes compare integer addition with string joining using the plus symbol." title="Two lanes compare integer addition with string joining using the plus symbol."/>
+            <wp:cNvGraphicFramePr>
+              <a:graphicFrameLocks xmlns:a="http://schemas.openxmlformats.org/drawingml/2006/main" noChangeAspect="1"/>
+            </wp:cNvGraphicFramePr>
+            <a:graphic xmlns:a="http://schemas.openxmlformats.org/drawingml/2006/main">
+              <a:graphicData uri="http://schemas.openxmlformats.org/drawingml/2006/picture">
+                <pic:pic xmlns:pic="http://schemas.openxmlformats.org/drawingml/2006/picture">
+                  <pic:nvPicPr>
+                    <pic:cNvPr id="0" name="" descr=""/>
+                    <pic:cNvPicPr>
+                      <a:picLocks noChangeAspect="1" noChangeArrowheads="1"/>
+                    </pic:cNvPicPr>
+                  </pic:nvPicPr>
+                  <pic:blipFill>
+                    <a:blip r:embed="rId17" cstate="none"/>
+                    <a:srcRect/>
+                    <a:stretch>
+                      <a:fillRect/>
+                    </a:stretch>
+                  </pic:blipFill>
+                  <pic:spPr bwMode="auto">
+                    <a:xfrm>
+                      <a:off x="0" y="0"/>
+                      <a:ext cx="5334000" cy="3552825"/>
+                    </a:xfrm>
+                    <a:prstGeom prst="rect">
+                      <a:avLst/>
+                    </a:prstGeom>
+                  </pic:spPr>
+                </pic:pic>
+              </a:graphicData>
+            </a:graphic>
+          </wp:inline>
+        </w:drawing>
+      </w:r>
+    </w:p>
+    <w:p>
+      <w:pPr>
+        <w:spacing w:after="120" w:line="300"/>
+        <w:jc w:val="center"/>
+      </w:pPr>
+      <w:r>
+        <w:rPr>
+          <w:i/>
+          <w:iCs/>
+          <w:color w:val="5B6575"/>
+          <w:sz w:val="19"/>
+          <w:szCs w:val="19"/>
+        </w:rPr>
+        <w:t xml:space="preserve">Top lane: int values 3 + 4 produce the int value 7. Bottom lane: str values "3" + "4" join to produce the str value "34".</w:t>
+      </w:r>
+    </w:p>
     <w:tbl>
       <w:tblPr>
         <w:tblW w:type="pct" w:w="100%"/>
@@ -9987,7 +10231,7 @@
       </w:r>
     </w:p>
     <w:p>
-      <w:hyperlink w:history="1" r:id="rIdi5a-o0rkyi9xdn8l1kkrz">
+      <w:hyperlink w:history="1" r:id="rIdyjfzxlux-v5wwo9qpxes2">
         <w:r>
           <w:rPr>
             <w:rStyle w:val="Hyperlink"/>

</xml_diff>